<commit_message>
Update Identify and Resolve clients ICT problems
</commit_message>
<xml_diff>
--- a/ICT/Identify and resolve cliens ICT problem/Assessment 2/ICT40120_Emerging_ICT_Tech_AT2.docx
+++ b/ICT/Identify and resolve cliens ICT problem/Assessment 2/ICT40120_Emerging_ICT_Tech_AT2.docx
@@ -706,28 +706,12 @@
               </w:rPr>
               <w:t xml:space="preserve"> </w:t>
             </w:r>
-            <w:sdt>
-              <w:sdtPr>
-                <w:rPr>
-                  <w:rFonts w:cs="Arial"/>
-                </w:rPr>
-                <w:id w:val="288942983"/>
-                <w:placeholder>
-                  <w:docPart w:val="1AED4CE419634409A4DE22308F25DFFF"/>
-                </w:placeholder>
-                <w:temporary/>
-                <w:showingPlcHdr/>
-              </w:sdtPr>
-              <w:sdtEndPr/>
-              <w:sdtContent>
-                <w:r>
-                  <w:rPr>
-                    <w:shd w:val="clear" w:color="auto" w:fill="FFFFCC"/>
-                  </w:rPr>
-                  <w:t>Insert name</w:t>
-                </w:r>
-              </w:sdtContent>
-            </w:sdt>
+            <w:r>
+              <w:rPr>
+                <w:rFonts w:cs="Arial"/>
+              </w:rPr>
+              <w:t>Van Minh Le</w:t>
+            </w:r>
           </w:p>
         </w:tc>
         <w:tc>
@@ -756,28 +740,12 @@
               </w:rPr>
               <w:t xml:space="preserve"> </w:t>
             </w:r>
-            <w:sdt>
-              <w:sdtPr>
-                <w:rPr>
-                  <w:rFonts w:cs="Arial"/>
-                </w:rPr>
-                <w:id w:val="1232667225"/>
-                <w:placeholder>
-                  <w:docPart w:val="B74775F5CEEB4AA8AA997E9C4E225814"/>
-                </w:placeholder>
-                <w:temporary/>
-                <w:showingPlcHdr/>
-              </w:sdtPr>
-              <w:sdtEndPr/>
-              <w:sdtContent>
-                <w:r>
-                  <w:rPr>
-                    <w:shd w:val="clear" w:color="auto" w:fill="FFFFCC"/>
-                  </w:rPr>
-                  <w:t>Insert ID</w:t>
-                </w:r>
-              </w:sdtContent>
-            </w:sdt>
+            <w:r>
+              <w:rPr>
+                <w:rFonts w:cs="Arial"/>
+              </w:rPr>
+              <w:t>100693330</w:t>
+            </w:r>
           </w:p>
         </w:tc>
       </w:tr>
@@ -1307,7 +1275,6 @@
                   <w:calendar w:val="gregorian"/>
                 </w:date>
               </w:sdtPr>
-              <w:sdtEndPr/>
               <w:sdtContent>
                 <w:r>
                   <w:rPr>
@@ -1427,7 +1394,6 @@
                   <w14:uncheckedState w14:val="2610" w14:font="MS Gothic"/>
                 </w14:checkbox>
               </w:sdtPr>
-              <w:sdtEndPr/>
               <w:sdtContent>
                 <w:r>
                   <w:rPr>
@@ -4596,6 +4562,7 @@
       <w:pPr>
         <w:rPr>
           <w:rFonts w:cs="Arial"/>
+          <w:color w:val="00B050"/>
           <w:szCs w:val="20"/>
         </w:rPr>
       </w:pPr>
@@ -4655,35 +4622,90 @@
           <w:rFonts w:cs="Arial"/>
           <w:szCs w:val="20"/>
         </w:rPr>
-        <w:t>for several years. However, they are facing many difficulties regarding the efficiency of its design systems</w:t>
+        <w:t xml:space="preserve">for several years. However, they are </w:t>
+      </w:r>
+      <w:r>
+        <w:rPr>
+          <w:rFonts w:cs="Arial"/>
+          <w:color w:val="FF0000"/>
+          <w:szCs w:val="20"/>
+        </w:rPr>
+        <w:t xml:space="preserve">facing many difficulties </w:t>
       </w:r>
       <w:r>
         <w:rPr>
           <w:rFonts w:cs="Arial"/>
           <w:szCs w:val="20"/>
         </w:rPr>
-        <w:t xml:space="preserve"> when working with clients and outdated portfolio showcase designs. They </w:t>
+        <w:t xml:space="preserve">regarding </w:t>
+      </w:r>
+      <w:r>
+        <w:rPr>
+          <w:rFonts w:cs="Arial"/>
+          <w:color w:val="FF0000"/>
+          <w:szCs w:val="20"/>
+        </w:rPr>
+        <w:t>the efficiency of its design systems</w:t>
       </w:r>
       <w:r>
         <w:rPr>
           <w:rFonts w:cs="Arial"/>
           <w:szCs w:val="20"/>
         </w:rPr>
-        <w:t>require critical thinking to upgrade th</w:t>
+        <w:t xml:space="preserve"> when working with clients and </w:t>
+      </w:r>
+      <w:r>
+        <w:rPr>
+          <w:rFonts w:cs="Arial"/>
+          <w:color w:val="FF0000"/>
+          <w:szCs w:val="20"/>
+        </w:rPr>
+        <w:t>outdated portfolio showcase designs</w:t>
       </w:r>
       <w:r>
         <w:rPr>
           <w:rFonts w:cs="Arial"/>
           <w:szCs w:val="20"/>
         </w:rPr>
-        <w:t>eir existing showcase designs and design systems</w:t>
+        <w:t xml:space="preserve">. They </w:t>
+      </w:r>
+      <w:r>
+        <w:rPr>
+          <w:rFonts w:cs="Arial"/>
+          <w:color w:val="00B050"/>
+          <w:szCs w:val="20"/>
+        </w:rPr>
+        <w:t>require</w:t>
       </w:r>
       <w:r>
         <w:rPr>
           <w:rFonts w:cs="Arial"/>
           <w:szCs w:val="20"/>
         </w:rPr>
-        <w:t xml:space="preserve">. </w:t>
+        <w:t xml:space="preserve"> critical thinking to </w:t>
+      </w:r>
+      <w:r>
+        <w:rPr>
+          <w:rFonts w:cs="Arial"/>
+          <w:color w:val="00B050"/>
+          <w:szCs w:val="20"/>
+        </w:rPr>
+        <w:t xml:space="preserve">upgrade their existing showcase designs </w:t>
+      </w:r>
+      <w:r>
+        <w:rPr>
+          <w:rFonts w:cs="Arial"/>
+          <w:szCs w:val="20"/>
+        </w:rPr>
+        <w:t xml:space="preserve">and </w:t>
+      </w:r>
+      <w:r>
+        <w:rPr>
+          <w:rFonts w:cs="Arial"/>
+          <w:color w:val="00B050"/>
+          <w:szCs w:val="20"/>
+        </w:rPr>
+        <w:t xml:space="preserve">design systems. </w:t>
       </w:r>
     </w:p>
     <w:p>
@@ -6778,6 +6800,646 @@
               </w:rPr>
               <w:t>Answer:</w:t>
             </w:r>
+            <w:r>
+              <w:rPr>
+                <w:rFonts w:cs="Arial"/>
+                <w:b/>
+                <w:color w:val="000000"/>
+                <w:szCs w:val="20"/>
+              </w:rPr>
+              <w:t xml:space="preserve"> </w:t>
+            </w:r>
+          </w:p>
+          <w:p>
+            <w:pPr>
+              <w:pStyle w:val="ListParagraph"/>
+              <w:numPr>
+                <w:ilvl w:val="0"/>
+                <w:numId w:val="44"/>
+              </w:numPr>
+              <w:spacing w:before="60" w:after="60"/>
+              <w:rPr>
+                <w:rFonts w:cs="Arial"/>
+                <w:b/>
+                <w:color w:val="000000"/>
+                <w:szCs w:val="20"/>
+              </w:rPr>
+            </w:pPr>
+            <w:r>
+              <w:rPr>
+                <w:rFonts w:cs="Arial"/>
+                <w:b/>
+                <w:color w:val="000000"/>
+                <w:szCs w:val="20"/>
+              </w:rPr>
+              <w:t>Client problems:</w:t>
+            </w:r>
+          </w:p>
+          <w:p>
+            <w:pPr>
+              <w:pStyle w:val="ListParagraph"/>
+              <w:numPr>
+                <w:ilvl w:val="0"/>
+                <w:numId w:val="45"/>
+              </w:numPr>
+              <w:spacing w:before="60" w:after="60"/>
+              <w:rPr>
+                <w:rFonts w:cs="Arial"/>
+                <w:bCs/>
+                <w:color w:val="000000"/>
+                <w:szCs w:val="20"/>
+              </w:rPr>
+            </w:pPr>
+            <w:r>
+              <w:rPr>
+                <w:rFonts w:cs="Arial"/>
+                <w:bCs/>
+                <w:color w:val="000000"/>
+                <w:szCs w:val="20"/>
+              </w:rPr>
+              <w:t>T</w:t>
+            </w:r>
+            <w:r>
+              <w:rPr>
+                <w:rFonts w:cs="Arial"/>
+                <w:bCs/>
+                <w:color w:val="000000"/>
+                <w:szCs w:val="20"/>
+              </w:rPr>
+              <w:t xml:space="preserve">he </w:t>
+            </w:r>
+            <w:r>
+              <w:rPr>
+                <w:rFonts w:cs="Arial"/>
+                <w:bCs/>
+                <w:color w:val="000000"/>
+                <w:szCs w:val="20"/>
+              </w:rPr>
+              <w:t>in</w:t>
+            </w:r>
+            <w:r>
+              <w:rPr>
+                <w:rFonts w:cs="Arial"/>
+                <w:bCs/>
+                <w:color w:val="000000"/>
+                <w:szCs w:val="20"/>
+              </w:rPr>
+              <w:t>efficiency of design systems</w:t>
+            </w:r>
+            <w:r>
+              <w:rPr>
+                <w:rFonts w:cs="Arial"/>
+                <w:bCs/>
+                <w:color w:val="000000"/>
+                <w:szCs w:val="20"/>
+              </w:rPr>
+              <w:t xml:space="preserve"> makes harder to work quickly</w:t>
+            </w:r>
+            <w:r>
+              <w:rPr>
+                <w:rFonts w:cs="Arial"/>
+                <w:bCs/>
+                <w:color w:val="000000"/>
+                <w:szCs w:val="20"/>
+              </w:rPr>
+              <w:t>,</w:t>
+            </w:r>
+            <w:r>
+              <w:t xml:space="preserve"> </w:t>
+            </w:r>
+            <w:r>
+              <w:t xml:space="preserve">produce </w:t>
+            </w:r>
+            <w:r>
+              <w:rPr>
+                <w:rFonts w:cs="Arial"/>
+                <w:bCs/>
+                <w:color w:val="000000"/>
+                <w:szCs w:val="20"/>
+              </w:rPr>
+              <w:t>q</w:t>
+            </w:r>
+            <w:r>
+              <w:rPr>
+                <w:rFonts w:cs="Arial"/>
+                <w:bCs/>
+                <w:color w:val="000000"/>
+                <w:szCs w:val="20"/>
+              </w:rPr>
+              <w:t>uality work</w:t>
+            </w:r>
+            <w:r>
+              <w:rPr>
+                <w:rFonts w:cs="Arial"/>
+                <w:bCs/>
+                <w:color w:val="000000"/>
+                <w:szCs w:val="20"/>
+              </w:rPr>
+              <w:t xml:space="preserve">. It </w:t>
+            </w:r>
+            <w:r>
+              <w:rPr>
+                <w:rFonts w:cs="Arial"/>
+                <w:bCs/>
+                <w:color w:val="000000"/>
+                <w:szCs w:val="20"/>
+              </w:rPr>
+              <w:t>could frustrate</w:t>
+            </w:r>
+            <w:r>
+              <w:rPr>
+                <w:rFonts w:cs="Arial"/>
+                <w:bCs/>
+                <w:color w:val="000000"/>
+                <w:szCs w:val="20"/>
+              </w:rPr>
+              <w:t xml:space="preserve"> when working with clients</w:t>
+            </w:r>
+            <w:r>
+              <w:rPr>
+                <w:rFonts w:cs="Arial"/>
+                <w:bCs/>
+                <w:color w:val="000000"/>
+                <w:szCs w:val="20"/>
+              </w:rPr>
+              <w:t>.</w:t>
+            </w:r>
+          </w:p>
+          <w:p>
+            <w:pPr>
+              <w:pStyle w:val="ListParagraph"/>
+              <w:numPr>
+                <w:ilvl w:val="0"/>
+                <w:numId w:val="45"/>
+              </w:numPr>
+              <w:spacing w:before="60" w:after="60"/>
+              <w:rPr>
+                <w:rFonts w:cs="Arial"/>
+                <w:bCs/>
+                <w:color w:val="000000"/>
+                <w:szCs w:val="20"/>
+              </w:rPr>
+            </w:pPr>
+            <w:r>
+              <w:rPr>
+                <w:rFonts w:cs="Arial"/>
+                <w:bCs/>
+                <w:color w:val="000000"/>
+                <w:szCs w:val="20"/>
+              </w:rPr>
+              <w:t xml:space="preserve">Outdated Portfolio showcase designs </w:t>
+            </w:r>
+            <w:r>
+              <w:rPr>
+                <w:rFonts w:cs="Arial"/>
+                <w:bCs/>
+                <w:color w:val="000000"/>
+                <w:szCs w:val="20"/>
+              </w:rPr>
+              <w:t>may not align with</w:t>
+            </w:r>
+            <w:r>
+              <w:rPr>
+                <w:rFonts w:cs="Arial"/>
+                <w:bCs/>
+                <w:color w:val="000000"/>
+                <w:szCs w:val="20"/>
+              </w:rPr>
+              <w:t xml:space="preserve"> modern design trends and fails to impress potential clients.</w:t>
+            </w:r>
+          </w:p>
+          <w:p>
+            <w:pPr>
+              <w:pStyle w:val="ListParagraph"/>
+              <w:numPr>
+                <w:ilvl w:val="0"/>
+                <w:numId w:val="44"/>
+              </w:numPr>
+              <w:spacing w:before="60" w:after="60"/>
+              <w:rPr>
+                <w:rFonts w:cs="Arial"/>
+                <w:b/>
+                <w:color w:val="000000"/>
+                <w:szCs w:val="20"/>
+              </w:rPr>
+            </w:pPr>
+            <w:r>
+              <w:rPr>
+                <w:rFonts w:cs="Arial"/>
+                <w:b/>
+                <w:color w:val="000000"/>
+                <w:szCs w:val="20"/>
+              </w:rPr>
+              <w:t>Impact on the client’s design procedures:</w:t>
+            </w:r>
+          </w:p>
+          <w:p>
+            <w:pPr>
+              <w:pStyle w:val="ListParagraph"/>
+              <w:numPr>
+                <w:ilvl w:val="0"/>
+                <w:numId w:val="45"/>
+              </w:numPr>
+              <w:spacing w:before="60" w:after="60"/>
+              <w:rPr>
+                <w:rFonts w:cs="Arial"/>
+                <w:bCs/>
+                <w:color w:val="000000"/>
+                <w:szCs w:val="20"/>
+              </w:rPr>
+            </w:pPr>
+            <w:r>
+              <w:rPr>
+                <w:rFonts w:cs="Arial"/>
+                <w:bCs/>
+                <w:color w:val="000000"/>
+                <w:szCs w:val="20"/>
+              </w:rPr>
+              <w:t xml:space="preserve">The inefficiency of design systems </w:t>
+            </w:r>
+            <w:r>
+              <w:rPr>
+                <w:rFonts w:cs="Arial"/>
+                <w:bCs/>
+                <w:color w:val="000000"/>
+                <w:szCs w:val="20"/>
+              </w:rPr>
+              <w:t>r</w:t>
+            </w:r>
+            <w:r>
+              <w:rPr>
+                <w:rFonts w:cs="Arial"/>
+                <w:bCs/>
+                <w:color w:val="000000"/>
+                <w:szCs w:val="20"/>
+              </w:rPr>
+              <w:t>educe</w:t>
+            </w:r>
+            <w:r>
+              <w:rPr>
+                <w:rFonts w:cs="Arial"/>
+                <w:bCs/>
+                <w:color w:val="000000"/>
+                <w:szCs w:val="20"/>
+              </w:rPr>
+              <w:t>s</w:t>
+            </w:r>
+            <w:r>
+              <w:rPr>
+                <w:rFonts w:cs="Arial"/>
+                <w:bCs/>
+                <w:color w:val="000000"/>
+                <w:szCs w:val="20"/>
+              </w:rPr>
+              <w:t xml:space="preserve"> </w:t>
+            </w:r>
+            <w:r>
+              <w:rPr>
+                <w:rFonts w:cs="Arial"/>
+                <w:bCs/>
+                <w:color w:val="000000"/>
+                <w:szCs w:val="20"/>
+              </w:rPr>
+              <w:t>c</w:t>
+            </w:r>
+            <w:r>
+              <w:rPr>
+                <w:rFonts w:cs="Arial"/>
+                <w:bCs/>
+                <w:color w:val="000000"/>
+                <w:szCs w:val="20"/>
+              </w:rPr>
+              <w:t xml:space="preserve">lient </w:t>
+            </w:r>
+            <w:r>
+              <w:rPr>
+                <w:rFonts w:cs="Arial"/>
+                <w:bCs/>
+                <w:color w:val="000000"/>
+                <w:szCs w:val="20"/>
+              </w:rPr>
+              <w:t>s</w:t>
+            </w:r>
+            <w:r>
+              <w:rPr>
+                <w:rFonts w:cs="Arial"/>
+                <w:bCs/>
+                <w:color w:val="000000"/>
+                <w:szCs w:val="20"/>
+              </w:rPr>
+              <w:t>atisfaction</w:t>
+            </w:r>
+            <w:r>
+              <w:rPr>
+                <w:rFonts w:cs="Arial"/>
+                <w:bCs/>
+                <w:color w:val="000000"/>
+                <w:szCs w:val="20"/>
+              </w:rPr>
+              <w:t>.</w:t>
+            </w:r>
+            <w:r>
+              <w:rPr>
+                <w:rFonts w:cs="Arial"/>
+                <w:bCs/>
+                <w:color w:val="000000"/>
+                <w:szCs w:val="20"/>
+              </w:rPr>
+              <w:t xml:space="preserve"> </w:t>
+            </w:r>
+            <w:r>
+              <w:rPr>
+                <w:rFonts w:cs="Arial"/>
+                <w:bCs/>
+                <w:color w:val="000000"/>
+                <w:szCs w:val="20"/>
+              </w:rPr>
+              <w:t>It s</w:t>
+            </w:r>
+            <w:r>
+              <w:rPr>
+                <w:rFonts w:cs="Arial"/>
+                <w:bCs/>
+                <w:color w:val="000000"/>
+                <w:szCs w:val="20"/>
+              </w:rPr>
+              <w:t>low</w:t>
+            </w:r>
+            <w:r>
+              <w:rPr>
+                <w:rFonts w:cs="Arial"/>
+                <w:bCs/>
+                <w:color w:val="000000"/>
+                <w:szCs w:val="20"/>
+              </w:rPr>
+              <w:t>s down</w:t>
+            </w:r>
+            <w:r>
+              <w:rPr>
+                <w:rFonts w:cs="Arial"/>
+                <w:bCs/>
+                <w:color w:val="000000"/>
+                <w:szCs w:val="20"/>
+              </w:rPr>
+              <w:t xml:space="preserve"> </w:t>
+            </w:r>
+            <w:r>
+              <w:rPr>
+                <w:rFonts w:cs="Arial"/>
+                <w:bCs/>
+                <w:color w:val="000000"/>
+                <w:szCs w:val="20"/>
+              </w:rPr>
+              <w:t>p</w:t>
+            </w:r>
+            <w:r>
+              <w:rPr>
+                <w:rFonts w:cs="Arial"/>
+                <w:bCs/>
+                <w:color w:val="000000"/>
+                <w:szCs w:val="20"/>
+              </w:rPr>
+              <w:t xml:space="preserve">roject </w:t>
+            </w:r>
+            <w:r>
+              <w:rPr>
+                <w:rFonts w:cs="Arial"/>
+                <w:bCs/>
+                <w:color w:val="000000"/>
+                <w:szCs w:val="20"/>
+              </w:rPr>
+              <w:t>d</w:t>
+            </w:r>
+            <w:r>
+              <w:rPr>
+                <w:rFonts w:cs="Arial"/>
+                <w:bCs/>
+                <w:color w:val="000000"/>
+                <w:szCs w:val="20"/>
+              </w:rPr>
+              <w:t>elivery</w:t>
+            </w:r>
+            <w:r>
+              <w:rPr>
+                <w:rFonts w:cs="Arial"/>
+                <w:bCs/>
+                <w:color w:val="000000"/>
+                <w:szCs w:val="20"/>
+              </w:rPr>
+              <w:t>.</w:t>
+            </w:r>
+          </w:p>
+          <w:p>
+            <w:pPr>
+              <w:pStyle w:val="ListParagraph"/>
+              <w:numPr>
+                <w:ilvl w:val="0"/>
+                <w:numId w:val="45"/>
+              </w:numPr>
+              <w:spacing w:before="60" w:after="60"/>
+              <w:rPr>
+                <w:rFonts w:cs="Arial"/>
+                <w:bCs/>
+                <w:color w:val="000000"/>
+                <w:szCs w:val="20"/>
+              </w:rPr>
+            </w:pPr>
+            <w:r>
+              <w:rPr>
+                <w:rFonts w:cs="Arial"/>
+                <w:bCs/>
+                <w:color w:val="000000"/>
+                <w:szCs w:val="20"/>
+              </w:rPr>
+              <w:t xml:space="preserve">An outdated portfolio </w:t>
+            </w:r>
+            <w:r>
+              <w:rPr>
+                <w:rFonts w:cs="Arial"/>
+                <w:bCs/>
+                <w:color w:val="000000"/>
+                <w:szCs w:val="20"/>
+              </w:rPr>
+              <w:t>creates a w</w:t>
+            </w:r>
+            <w:r>
+              <w:rPr>
+                <w:rFonts w:cs="Arial"/>
+                <w:bCs/>
+                <w:color w:val="000000"/>
+                <w:szCs w:val="20"/>
+              </w:rPr>
+              <w:t xml:space="preserve">eak </w:t>
+            </w:r>
+            <w:r>
+              <w:rPr>
+                <w:rFonts w:cs="Arial"/>
+                <w:bCs/>
+                <w:color w:val="000000"/>
+                <w:szCs w:val="20"/>
+              </w:rPr>
+              <w:t>b</w:t>
+            </w:r>
+            <w:r>
+              <w:rPr>
+                <w:rFonts w:cs="Arial"/>
+                <w:bCs/>
+                <w:color w:val="000000"/>
+                <w:szCs w:val="20"/>
+              </w:rPr>
+              <w:t xml:space="preserve">rand </w:t>
+            </w:r>
+            <w:r>
+              <w:rPr>
+                <w:rFonts w:cs="Arial"/>
+                <w:bCs/>
+                <w:color w:val="000000"/>
+                <w:szCs w:val="20"/>
+              </w:rPr>
+              <w:t>i</w:t>
+            </w:r>
+            <w:r>
+              <w:rPr>
+                <w:rFonts w:cs="Arial"/>
+                <w:bCs/>
+                <w:color w:val="000000"/>
+                <w:szCs w:val="20"/>
+              </w:rPr>
+              <w:t>mage</w:t>
+            </w:r>
+            <w:r>
+              <w:rPr>
+                <w:rFonts w:cs="Arial"/>
+                <w:bCs/>
+                <w:color w:val="000000"/>
+                <w:szCs w:val="20"/>
+              </w:rPr>
+              <w:t>.</w:t>
+            </w:r>
+          </w:p>
+          <w:p>
+            <w:pPr>
+              <w:pStyle w:val="ListParagraph"/>
+              <w:numPr>
+                <w:ilvl w:val="0"/>
+                <w:numId w:val="45"/>
+              </w:numPr>
+              <w:spacing w:before="60" w:after="60"/>
+              <w:rPr>
+                <w:rFonts w:cs="Arial"/>
+                <w:bCs/>
+                <w:color w:val="000000"/>
+                <w:szCs w:val="20"/>
+              </w:rPr>
+            </w:pPr>
+            <w:r>
+              <w:rPr>
+                <w:rFonts w:cs="Arial"/>
+                <w:bCs/>
+                <w:color w:val="000000"/>
+                <w:szCs w:val="20"/>
+              </w:rPr>
+              <w:t>P</w:t>
+            </w:r>
+            <w:r>
+              <w:rPr>
+                <w:rFonts w:cs="Arial"/>
+                <w:bCs/>
+                <w:color w:val="000000"/>
+                <w:szCs w:val="20"/>
+              </w:rPr>
+              <w:t>ortfolio</w:t>
+            </w:r>
+            <w:r>
+              <w:rPr>
+                <w:rFonts w:cs="Arial"/>
+                <w:bCs/>
+                <w:color w:val="000000"/>
+                <w:szCs w:val="20"/>
+              </w:rPr>
+              <w:t xml:space="preserve"> </w:t>
+            </w:r>
+            <w:r>
+              <w:rPr>
+                <w:rFonts w:cs="Arial"/>
+                <w:bCs/>
+                <w:color w:val="000000"/>
+                <w:szCs w:val="20"/>
+              </w:rPr>
+              <w:t>showcase design</w:t>
+            </w:r>
+            <w:r>
+              <w:rPr>
+                <w:rFonts w:cs="Arial"/>
+                <w:bCs/>
+                <w:color w:val="000000"/>
+                <w:szCs w:val="20"/>
+              </w:rPr>
+              <w:t>s</w:t>
+            </w:r>
+            <w:r>
+              <w:rPr>
+                <w:rFonts w:cs="Arial"/>
+                <w:bCs/>
+                <w:color w:val="000000"/>
+                <w:szCs w:val="20"/>
+              </w:rPr>
+              <w:t xml:space="preserve"> </w:t>
+            </w:r>
+            <w:r>
+              <w:rPr>
+                <w:rFonts w:cs="Arial"/>
+                <w:bCs/>
+                <w:color w:val="000000"/>
+                <w:szCs w:val="20"/>
+              </w:rPr>
+              <w:t>f</w:t>
+            </w:r>
+            <w:r>
+              <w:rPr>
+                <w:rFonts w:cs="Arial"/>
+                <w:bCs/>
+                <w:color w:val="000000"/>
+                <w:szCs w:val="20"/>
+              </w:rPr>
+              <w:t>all</w:t>
+            </w:r>
+            <w:r>
+              <w:rPr>
+                <w:rFonts w:cs="Arial"/>
+                <w:bCs/>
+                <w:color w:val="000000"/>
+                <w:szCs w:val="20"/>
+              </w:rPr>
+              <w:t>s</w:t>
+            </w:r>
+            <w:r>
+              <w:rPr>
+                <w:rFonts w:cs="Arial"/>
+                <w:bCs/>
+                <w:color w:val="000000"/>
+                <w:szCs w:val="20"/>
+              </w:rPr>
+              <w:t xml:space="preserve"> behind </w:t>
+            </w:r>
+            <w:r>
+              <w:rPr>
+                <w:rFonts w:cs="Arial"/>
+                <w:bCs/>
+                <w:color w:val="000000"/>
+                <w:szCs w:val="20"/>
+              </w:rPr>
+              <w:t xml:space="preserve">modern standards </w:t>
+            </w:r>
+            <w:r>
+              <w:rPr>
+                <w:rFonts w:cs="Arial"/>
+                <w:bCs/>
+                <w:color w:val="000000"/>
+                <w:szCs w:val="20"/>
+              </w:rPr>
+              <w:t>can lower the business's competitiveness and hinder growth.</w:t>
+            </w:r>
           </w:p>
           <w:p>
             <w:pPr>
@@ -7098,6 +7760,52 @@
                 <w:szCs w:val="20"/>
               </w:rPr>
               <w:t>Answer:</w:t>
+            </w:r>
+          </w:p>
+          <w:p>
+            <w:pPr>
+              <w:pStyle w:val="ListParagraph"/>
+              <w:numPr>
+                <w:ilvl w:val="0"/>
+                <w:numId w:val="45"/>
+              </w:numPr>
+              <w:spacing w:before="60" w:after="60"/>
+              <w:rPr>
+                <w:rFonts w:cs="Arial"/>
+                <w:bCs/>
+                <w:szCs w:val="20"/>
+              </w:rPr>
+            </w:pPr>
+            <w:r>
+              <w:rPr>
+                <w:rFonts w:cs="Arial"/>
+                <w:bCs/>
+                <w:szCs w:val="20"/>
+              </w:rPr>
+              <w:t>The client has recognized of Issues</w:t>
+            </w:r>
+          </w:p>
+          <w:p>
+            <w:pPr>
+              <w:pStyle w:val="ListParagraph"/>
+              <w:numPr>
+                <w:ilvl w:val="0"/>
+                <w:numId w:val="45"/>
+              </w:numPr>
+              <w:spacing w:before="60" w:after="60"/>
+              <w:rPr>
+                <w:rFonts w:cs="Arial"/>
+                <w:bCs/>
+                <w:szCs w:val="20"/>
+              </w:rPr>
+            </w:pPr>
+            <w:r>
+              <w:rPr>
+                <w:rFonts w:cs="Arial"/>
+                <w:bCs/>
+                <w:szCs w:val="20"/>
+              </w:rPr>
+              <w:t>They require critical thinking to upgrade their existing systems and improve the showcase designs.</w:t>
             </w:r>
           </w:p>
           <w:p>
@@ -7494,7 +8202,6 @@
                 <w:color w:val="000000"/>
                 <w:szCs w:val="20"/>
               </w:rPr>
-              <w:lastRenderedPageBreak/>
               <w:t>Question 4</w:t>
             </w:r>
             <w:r>
@@ -9217,6 +9924,7 @@
                 <w:color w:val="000000"/>
                 <w:szCs w:val="20"/>
               </w:rPr>
+              <w:lastRenderedPageBreak/>
               <w:t>Answer:</w:t>
             </w:r>
           </w:p>
@@ -9902,7 +10610,6 @@
                 <w:color w:val="000000"/>
                 <w:szCs w:val="20"/>
               </w:rPr>
-              <w:lastRenderedPageBreak/>
               <w:t>Answer:</w:t>
             </w:r>
           </w:p>
@@ -11314,6 +12021,7 @@
               <w:jc w:val="left"/>
             </w:pPr>
             <w:r>
+              <w:lastRenderedPageBreak/>
               <w:t>In this assessment task you will be performing the following activities:</w:t>
             </w:r>
           </w:p>
@@ -11623,7 +12331,6 @@
                   <w14:uncheckedState w14:val="2610" w14:font="MS Gothic"/>
                 </w14:checkbox>
               </w:sdtPr>
-              <w:sdtEndPr/>
               <w:sdtContent>
                 <w:r>
                   <w:rPr>
@@ -11665,7 +12372,6 @@
                   <w14:uncheckedState w14:val="2610" w14:font="MS Gothic"/>
                 </w14:checkbox>
               </w:sdtPr>
-              <w:sdtEndPr/>
               <w:sdtContent>
                 <w:r>
                   <w:rPr>
@@ -11707,7 +12413,6 @@
                   <w14:uncheckedState w14:val="2610" w14:font="MS Gothic"/>
                 </w14:checkbox>
               </w:sdtPr>
-              <w:sdtEndPr/>
               <w:sdtContent>
                 <w:r>
                   <w:rPr>
@@ -11749,7 +12454,6 @@
                   <w14:uncheckedState w14:val="2610" w14:font="MS Gothic"/>
                 </w14:checkbox>
               </w:sdtPr>
-              <w:sdtEndPr/>
               <w:sdtContent>
                 <w:r>
                   <w:rPr>
@@ -11791,7 +12495,6 @@
                   <w14:uncheckedState w14:val="2610" w14:font="MS Gothic"/>
                 </w14:checkbox>
               </w:sdtPr>
-              <w:sdtEndPr/>
               <w:sdtContent>
                 <w:r>
                   <w:rPr>
@@ -11833,7 +12536,6 @@
                   <w14:uncheckedState w14:val="2610" w14:font="MS Gothic"/>
                 </w14:checkbox>
               </w:sdtPr>
-              <w:sdtEndPr/>
               <w:sdtContent>
                 <w:r>
                   <w:rPr>
@@ -11885,14 +12587,7 @@
               <w:rPr>
                 <w:rFonts w:cs="Arial"/>
               </w:rPr>
-              <w:t xml:space="preserve">The learner has undertaken the impact analysis of the </w:t>
-            </w:r>
-            <w:r>
-              <w:rPr>
-                <w:rFonts w:cs="Arial"/>
-              </w:rPr>
-              <w:lastRenderedPageBreak/>
-              <w:t>design system problems and determined the severity and risks associated with the proposed solutions</w:t>
+              <w:t>The learner has undertaken the impact analysis of the design system problems and determined the severity and risks associated with the proposed solutions</w:t>
             </w:r>
             <w:r>
               <w:rPr>
@@ -11928,7 +12623,6 @@
                   <w14:uncheckedState w14:val="2610" w14:font="MS Gothic"/>
                 </w14:checkbox>
               </w:sdtPr>
-              <w:sdtEndPr/>
               <w:sdtContent>
                 <w:r>
                   <w:rPr>
@@ -11970,7 +12664,6 @@
                   <w14:uncheckedState w14:val="2610" w14:font="MS Gothic"/>
                 </w14:checkbox>
               </w:sdtPr>
-              <w:sdtEndPr/>
               <w:sdtContent>
                 <w:r>
                   <w:rPr>
@@ -12012,7 +12705,6 @@
                   <w14:uncheckedState w14:val="2610" w14:font="MS Gothic"/>
                 </w14:checkbox>
               </w:sdtPr>
-              <w:sdtEndPr/>
               <w:sdtContent>
                 <w:r>
                   <w:rPr>
@@ -12054,7 +12746,6 @@
                   <w14:uncheckedState w14:val="2610" w14:font="MS Gothic"/>
                 </w14:checkbox>
               </w:sdtPr>
-              <w:sdtEndPr/>
               <w:sdtContent>
                 <w:r>
                   <w:rPr>
@@ -12096,7 +12787,6 @@
                   <w14:uncheckedState w14:val="2610" w14:font="MS Gothic"/>
                 </w14:checkbox>
               </w:sdtPr>
-              <w:sdtEndPr/>
               <w:sdtContent>
                 <w:r>
                   <w:rPr>
@@ -12138,7 +12828,6 @@
                   <w14:uncheckedState w14:val="2610" w14:font="MS Gothic"/>
                 </w14:checkbox>
               </w:sdtPr>
-              <w:sdtEndPr/>
               <w:sdtContent>
                 <w:r>
                   <w:rPr>
@@ -12232,7 +12921,6 @@
                   <w14:uncheckedState w14:val="2610" w14:font="MS Gothic"/>
                 </w14:checkbox>
               </w:sdtPr>
-              <w:sdtEndPr/>
               <w:sdtContent>
                 <w:r>
                   <w:rPr>
@@ -12274,7 +12962,6 @@
                   <w14:uncheckedState w14:val="2610" w14:font="MS Gothic"/>
                 </w14:checkbox>
               </w:sdtPr>
-              <w:sdtEndPr/>
               <w:sdtContent>
                 <w:r>
                   <w:rPr>
@@ -12316,7 +13003,6 @@
                   <w14:uncheckedState w14:val="2610" w14:font="MS Gothic"/>
                 </w14:checkbox>
               </w:sdtPr>
-              <w:sdtEndPr/>
               <w:sdtContent>
                 <w:r>
                   <w:rPr>
@@ -12358,7 +13044,6 @@
                   <w14:uncheckedState w14:val="2610" w14:font="MS Gothic"/>
                 </w14:checkbox>
               </w:sdtPr>
-              <w:sdtEndPr/>
               <w:sdtContent>
                 <w:r>
                   <w:rPr>
@@ -12400,7 +13085,6 @@
                   <w14:uncheckedState w14:val="2610" w14:font="MS Gothic"/>
                 </w14:checkbox>
               </w:sdtPr>
-              <w:sdtEndPr/>
               <w:sdtContent>
                 <w:r>
                   <w:rPr>
@@ -12442,7 +13126,6 @@
                   <w14:uncheckedState w14:val="2610" w14:font="MS Gothic"/>
                 </w14:checkbox>
               </w:sdtPr>
-              <w:sdtEndPr/>
               <w:sdtContent>
                 <w:r>
                   <w:rPr>
@@ -12536,7 +13219,6 @@
                   <w14:uncheckedState w14:val="2610" w14:font="MS Gothic"/>
                 </w14:checkbox>
               </w:sdtPr>
-              <w:sdtEndPr/>
               <w:sdtContent>
                 <w:r>
                   <w:rPr>
@@ -12578,7 +13260,6 @@
                   <w14:uncheckedState w14:val="2610" w14:font="MS Gothic"/>
                 </w14:checkbox>
               </w:sdtPr>
-              <w:sdtEndPr/>
               <w:sdtContent>
                 <w:r>
                   <w:rPr>
@@ -12620,7 +13301,6 @@
                   <w14:uncheckedState w14:val="2610" w14:font="MS Gothic"/>
                 </w14:checkbox>
               </w:sdtPr>
-              <w:sdtEndPr/>
               <w:sdtContent>
                 <w:r>
                   <w:rPr>
@@ -12662,7 +13342,6 @@
                   <w14:uncheckedState w14:val="2610" w14:font="MS Gothic"/>
                 </w14:checkbox>
               </w:sdtPr>
-              <w:sdtEndPr/>
               <w:sdtContent>
                 <w:r>
                   <w:rPr>
@@ -12704,7 +13383,6 @@
                   <w14:uncheckedState w14:val="2610" w14:font="MS Gothic"/>
                 </w14:checkbox>
               </w:sdtPr>
-              <w:sdtEndPr/>
               <w:sdtContent>
                 <w:r>
                   <w:rPr>
@@ -12746,7 +13424,6 @@
                   <w14:uncheckedState w14:val="2610" w14:font="MS Gothic"/>
                 </w14:checkbox>
               </w:sdtPr>
-              <w:sdtEndPr/>
               <w:sdtContent>
                 <w:r>
                   <w:rPr>
@@ -12834,7 +13511,6 @@
                   <w14:uncheckedState w14:val="2610" w14:font="MS Gothic"/>
                 </w14:checkbox>
               </w:sdtPr>
-              <w:sdtEndPr/>
               <w:sdtContent>
                 <w:r>
                   <w:rPr>
@@ -12876,7 +13552,6 @@
                   <w14:uncheckedState w14:val="2610" w14:font="MS Gothic"/>
                 </w14:checkbox>
               </w:sdtPr>
-              <w:sdtEndPr/>
               <w:sdtContent>
                 <w:r>
                   <w:rPr>
@@ -12918,7 +13593,6 @@
                   <w14:uncheckedState w14:val="2610" w14:font="MS Gothic"/>
                 </w14:checkbox>
               </w:sdtPr>
-              <w:sdtEndPr/>
               <w:sdtContent>
                 <w:r>
                   <w:rPr>
@@ -12960,7 +13634,6 @@
                   <w14:uncheckedState w14:val="2610" w14:font="MS Gothic"/>
                 </w14:checkbox>
               </w:sdtPr>
-              <w:sdtEndPr/>
               <w:sdtContent>
                 <w:r>
                   <w:rPr>
@@ -13002,7 +13675,6 @@
                   <w14:uncheckedState w14:val="2610" w14:font="MS Gothic"/>
                 </w14:checkbox>
               </w:sdtPr>
-              <w:sdtEndPr/>
               <w:sdtContent>
                 <w:r>
                   <w:rPr>
@@ -13044,7 +13716,6 @@
                   <w14:uncheckedState w14:val="2610" w14:font="MS Gothic"/>
                 </w14:checkbox>
               </w:sdtPr>
-              <w:sdtEndPr/>
               <w:sdtContent>
                 <w:r>
                   <w:rPr>
@@ -13988,6 +14659,7 @@
                 <w:color w:val="000000" w:themeColor="text1"/>
                 <w:szCs w:val="20"/>
               </w:rPr>
+              <w:lastRenderedPageBreak/>
               <w:t>Satisfactory response</w:t>
             </w:r>
           </w:p>
@@ -14949,7 +15621,6 @@
                   <w14:uncheckedState w14:val="2610" w14:font="MS Gothic"/>
                 </w14:checkbox>
               </w:sdtPr>
-              <w:sdtEndPr/>
               <w:sdtContent>
                 <w:r>
                   <w:rPr>
@@ -14991,7 +15662,6 @@
                   <w14:uncheckedState w14:val="2610" w14:font="MS Gothic"/>
                 </w14:checkbox>
               </w:sdtPr>
-              <w:sdtEndPr/>
               <w:sdtContent>
                 <w:r>
                   <w:rPr>
@@ -15033,7 +15703,6 @@
                   <w14:uncheckedState w14:val="2610" w14:font="MS Gothic"/>
                 </w14:checkbox>
               </w:sdtPr>
-              <w:sdtEndPr/>
               <w:sdtContent>
                 <w:r>
                   <w:rPr>
@@ -15075,7 +15744,6 @@
                   <w14:uncheckedState w14:val="2610" w14:font="MS Gothic"/>
                 </w14:checkbox>
               </w:sdtPr>
-              <w:sdtEndPr/>
               <w:sdtContent>
                 <w:r>
                   <w:rPr>
@@ -15117,7 +15785,6 @@
                   <w14:uncheckedState w14:val="2610" w14:font="MS Gothic"/>
                 </w14:checkbox>
               </w:sdtPr>
-              <w:sdtEndPr/>
               <w:sdtContent>
                 <w:r>
                   <w:rPr>
@@ -15159,7 +15826,6 @@
                   <w14:uncheckedState w14:val="2610" w14:font="MS Gothic"/>
                 </w14:checkbox>
               </w:sdtPr>
-              <w:sdtEndPr/>
               <w:sdtContent>
                 <w:r>
                   <w:rPr>
@@ -15241,7 +15907,6 @@
                   <w14:uncheckedState w14:val="2610" w14:font="MS Gothic"/>
                 </w14:checkbox>
               </w:sdtPr>
-              <w:sdtEndPr/>
               <w:sdtContent>
                 <w:r>
                   <w:rPr>
@@ -15283,7 +15948,6 @@
                   <w14:uncheckedState w14:val="2610" w14:font="MS Gothic"/>
                 </w14:checkbox>
               </w:sdtPr>
-              <w:sdtEndPr/>
               <w:sdtContent>
                 <w:r>
                   <w:rPr>
@@ -15325,7 +15989,6 @@
                   <w14:uncheckedState w14:val="2610" w14:font="MS Gothic"/>
                 </w14:checkbox>
               </w:sdtPr>
-              <w:sdtEndPr/>
               <w:sdtContent>
                 <w:r>
                   <w:rPr>
@@ -15367,7 +16030,6 @@
                   <w14:uncheckedState w14:val="2610" w14:font="MS Gothic"/>
                 </w14:checkbox>
               </w:sdtPr>
-              <w:sdtEndPr/>
               <w:sdtContent>
                 <w:r>
                   <w:rPr>
@@ -15409,7 +16071,6 @@
                   <w14:uncheckedState w14:val="2610" w14:font="MS Gothic"/>
                 </w14:checkbox>
               </w:sdtPr>
-              <w:sdtEndPr/>
               <w:sdtContent>
                 <w:r>
                   <w:rPr>
@@ -15451,7 +16112,6 @@
                   <w14:uncheckedState w14:val="2610" w14:font="MS Gothic"/>
                 </w14:checkbox>
               </w:sdtPr>
-              <w:sdtEndPr/>
               <w:sdtContent>
                 <w:r>
                   <w:rPr>
@@ -15533,7 +16193,6 @@
                   <w14:uncheckedState w14:val="2610" w14:font="MS Gothic"/>
                 </w14:checkbox>
               </w:sdtPr>
-              <w:sdtEndPr/>
               <w:sdtContent>
                 <w:r>
                   <w:rPr>
@@ -15575,7 +16234,6 @@
                   <w14:uncheckedState w14:val="2610" w14:font="MS Gothic"/>
                 </w14:checkbox>
               </w:sdtPr>
-              <w:sdtEndPr/>
               <w:sdtContent>
                 <w:r>
                   <w:rPr>
@@ -15617,7 +16275,6 @@
                   <w14:uncheckedState w14:val="2610" w14:font="MS Gothic"/>
                 </w14:checkbox>
               </w:sdtPr>
-              <w:sdtEndPr/>
               <w:sdtContent>
                 <w:r>
                   <w:rPr>
@@ -15659,7 +16316,6 @@
                   <w14:uncheckedState w14:val="2610" w14:font="MS Gothic"/>
                 </w14:checkbox>
               </w:sdtPr>
-              <w:sdtEndPr/>
               <w:sdtContent>
                 <w:r>
                   <w:rPr>
@@ -15701,7 +16357,6 @@
                   <w14:uncheckedState w14:val="2610" w14:font="MS Gothic"/>
                 </w14:checkbox>
               </w:sdtPr>
-              <w:sdtEndPr/>
               <w:sdtContent>
                 <w:r>
                   <w:rPr>
@@ -15743,7 +16398,6 @@
                   <w14:uncheckedState w14:val="2610" w14:font="MS Gothic"/>
                 </w14:checkbox>
               </w:sdtPr>
-              <w:sdtEndPr/>
               <w:sdtContent>
                 <w:r>
                   <w:rPr>
@@ -15825,7 +16479,6 @@
                   <w14:uncheckedState w14:val="2610" w14:font="MS Gothic"/>
                 </w14:checkbox>
               </w:sdtPr>
-              <w:sdtEndPr/>
               <w:sdtContent>
                 <w:r>
                   <w:rPr>
@@ -15867,7 +16520,6 @@
                   <w14:uncheckedState w14:val="2610" w14:font="MS Gothic"/>
                 </w14:checkbox>
               </w:sdtPr>
-              <w:sdtEndPr/>
               <w:sdtContent>
                 <w:r>
                   <w:rPr>
@@ -15909,7 +16561,6 @@
                   <w14:uncheckedState w14:val="2610" w14:font="MS Gothic"/>
                 </w14:checkbox>
               </w:sdtPr>
-              <w:sdtEndPr/>
               <w:sdtContent>
                 <w:r>
                   <w:rPr>
@@ -15951,7 +16602,6 @@
                   <w14:uncheckedState w14:val="2610" w14:font="MS Gothic"/>
                 </w14:checkbox>
               </w:sdtPr>
-              <w:sdtEndPr/>
               <w:sdtContent>
                 <w:r>
                   <w:rPr>
@@ -15993,7 +16643,6 @@
                   <w14:uncheckedState w14:val="2610" w14:font="MS Gothic"/>
                 </w14:checkbox>
               </w:sdtPr>
-              <w:sdtEndPr/>
               <w:sdtContent>
                 <w:r>
                   <w:rPr>
@@ -16035,7 +16684,6 @@
                   <w14:uncheckedState w14:val="2610" w14:font="MS Gothic"/>
                 </w14:checkbox>
               </w:sdtPr>
-              <w:sdtEndPr/>
               <w:sdtContent>
                 <w:r>
                   <w:rPr>
@@ -16129,7 +16777,6 @@
                   <w14:uncheckedState w14:val="2610" w14:font="MS Gothic"/>
                 </w14:checkbox>
               </w:sdtPr>
-              <w:sdtEndPr/>
               <w:sdtContent>
                 <w:r>
                   <w:rPr>
@@ -16171,7 +16818,6 @@
                   <w14:uncheckedState w14:val="2610" w14:font="MS Gothic"/>
                 </w14:checkbox>
               </w:sdtPr>
-              <w:sdtEndPr/>
               <w:sdtContent>
                 <w:r>
                   <w:rPr>
@@ -16213,7 +16859,6 @@
                   <w14:uncheckedState w14:val="2610" w14:font="MS Gothic"/>
                 </w14:checkbox>
               </w:sdtPr>
-              <w:sdtEndPr/>
               <w:sdtContent>
                 <w:r>
                   <w:rPr>
@@ -16255,7 +16900,6 @@
                   <w14:uncheckedState w14:val="2610" w14:font="MS Gothic"/>
                 </w14:checkbox>
               </w:sdtPr>
-              <w:sdtEndPr/>
               <w:sdtContent>
                 <w:r>
                   <w:rPr>
@@ -16297,7 +16941,6 @@
                   <w14:uncheckedState w14:val="2610" w14:font="MS Gothic"/>
                 </w14:checkbox>
               </w:sdtPr>
-              <w:sdtEndPr/>
               <w:sdtContent>
                 <w:r>
                   <w:rPr>
@@ -16339,7 +16982,6 @@
                   <w14:uncheckedState w14:val="2610" w14:font="MS Gothic"/>
                 </w14:checkbox>
               </w:sdtPr>
-              <w:sdtEndPr/>
               <w:sdtContent>
                 <w:r>
                   <w:rPr>
@@ -16391,7 +17033,14 @@
               <w:rPr>
                 <w:rFonts w:cs="Arial"/>
               </w:rPr>
-              <w:t>The learner has prepared a maintenance report according to the client’s organisational procedures.</w:t>
+              <w:t xml:space="preserve">The learner has prepared a maintenance report </w:t>
+            </w:r>
+            <w:r>
+              <w:rPr>
+                <w:rFonts w:cs="Arial"/>
+              </w:rPr>
+              <w:lastRenderedPageBreak/>
+              <w:t>according to the client’s organisational procedures.</w:t>
             </w:r>
           </w:p>
         </w:tc>
@@ -16421,7 +17070,6 @@
                   <w14:uncheckedState w14:val="2610" w14:font="MS Gothic"/>
                 </w14:checkbox>
               </w:sdtPr>
-              <w:sdtEndPr/>
               <w:sdtContent>
                 <w:r>
                   <w:rPr>
@@ -16463,7 +17111,6 @@
                   <w14:uncheckedState w14:val="2610" w14:font="MS Gothic"/>
                 </w14:checkbox>
               </w:sdtPr>
-              <w:sdtEndPr/>
               <w:sdtContent>
                 <w:r>
                   <w:rPr>
@@ -16505,7 +17152,6 @@
                   <w14:uncheckedState w14:val="2610" w14:font="MS Gothic"/>
                 </w14:checkbox>
               </w:sdtPr>
-              <w:sdtEndPr/>
               <w:sdtContent>
                 <w:r>
                   <w:rPr>
@@ -16547,7 +17193,6 @@
                   <w14:uncheckedState w14:val="2610" w14:font="MS Gothic"/>
                 </w14:checkbox>
               </w:sdtPr>
-              <w:sdtEndPr/>
               <w:sdtContent>
                 <w:r>
                   <w:rPr>
@@ -16589,7 +17234,6 @@
                   <w14:uncheckedState w14:val="2610" w14:font="MS Gothic"/>
                 </w14:checkbox>
               </w:sdtPr>
-              <w:sdtEndPr/>
               <w:sdtContent>
                 <w:r>
                   <w:rPr>
@@ -16631,7 +17275,6 @@
                   <w14:uncheckedState w14:val="2610" w14:font="MS Gothic"/>
                 </w14:checkbox>
               </w:sdtPr>
-              <w:sdtEndPr/>
               <w:sdtContent>
                 <w:r>
                   <w:rPr>
@@ -18655,6 +19298,7 @@
               <w:pStyle w:val="Heading3"/>
             </w:pPr>
             <w:r>
+              <w:lastRenderedPageBreak/>
               <w:t>Learner Acknowledgement and Cover Sheet</w:t>
             </w:r>
           </w:p>
@@ -19060,7 +19704,6 @@
               <w:rPr>
                 <w:rStyle w:val="Strong"/>
               </w:rPr>
-              <w:lastRenderedPageBreak/>
               <w:t>Learner</w:t>
             </w:r>
             <w:r>
@@ -21432,6 +22075,205 @@
     </w:lvl>
   </w:abstractNum>
   <w:abstractNum w:abstractNumId="12" w15:restartNumberingAfterBreak="0">
+    <w:nsid w:val="199E0316"/>
+    <w:multiLevelType w:val="hybridMultilevel"/>
+    <w:tmpl w:val="23749350"/>
+    <w:lvl w:ilvl="0" w:tplc="0409000F">
+      <w:start w:val="1"/>
+      <w:numFmt w:val="decimal"/>
+      <w:lvlText w:val="%1."/>
+      <w:lvlJc w:val="left"/>
+      <w:pPr>
+        <w:ind w:left="720" w:hanging="360"/>
+      </w:pPr>
+    </w:lvl>
+    <w:lvl w:ilvl="1" w:tplc="04090019" w:tentative="1">
+      <w:start w:val="1"/>
+      <w:numFmt w:val="lowerLetter"/>
+      <w:lvlText w:val="%2."/>
+      <w:lvlJc w:val="left"/>
+      <w:pPr>
+        <w:ind w:left="1440" w:hanging="360"/>
+      </w:pPr>
+    </w:lvl>
+    <w:lvl w:ilvl="2" w:tplc="0409001B" w:tentative="1">
+      <w:start w:val="1"/>
+      <w:numFmt w:val="lowerRoman"/>
+      <w:lvlText w:val="%3."/>
+      <w:lvlJc w:val="right"/>
+      <w:pPr>
+        <w:ind w:left="2160" w:hanging="180"/>
+      </w:pPr>
+    </w:lvl>
+    <w:lvl w:ilvl="3" w:tplc="0409000F" w:tentative="1">
+      <w:start w:val="1"/>
+      <w:numFmt w:val="decimal"/>
+      <w:lvlText w:val="%4."/>
+      <w:lvlJc w:val="left"/>
+      <w:pPr>
+        <w:ind w:left="2880" w:hanging="360"/>
+      </w:pPr>
+    </w:lvl>
+    <w:lvl w:ilvl="4" w:tplc="04090019" w:tentative="1">
+      <w:start w:val="1"/>
+      <w:numFmt w:val="lowerLetter"/>
+      <w:lvlText w:val="%5."/>
+      <w:lvlJc w:val="left"/>
+      <w:pPr>
+        <w:ind w:left="3600" w:hanging="360"/>
+      </w:pPr>
+    </w:lvl>
+    <w:lvl w:ilvl="5" w:tplc="0409001B" w:tentative="1">
+      <w:start w:val="1"/>
+      <w:numFmt w:val="lowerRoman"/>
+      <w:lvlText w:val="%6."/>
+      <w:lvlJc w:val="right"/>
+      <w:pPr>
+        <w:ind w:left="4320" w:hanging="180"/>
+      </w:pPr>
+    </w:lvl>
+    <w:lvl w:ilvl="6" w:tplc="0409000F" w:tentative="1">
+      <w:start w:val="1"/>
+      <w:numFmt w:val="decimal"/>
+      <w:lvlText w:val="%7."/>
+      <w:lvlJc w:val="left"/>
+      <w:pPr>
+        <w:ind w:left="5040" w:hanging="360"/>
+      </w:pPr>
+    </w:lvl>
+    <w:lvl w:ilvl="7" w:tplc="04090019" w:tentative="1">
+      <w:start w:val="1"/>
+      <w:numFmt w:val="lowerLetter"/>
+      <w:lvlText w:val="%8."/>
+      <w:lvlJc w:val="left"/>
+      <w:pPr>
+        <w:ind w:left="5760" w:hanging="360"/>
+      </w:pPr>
+    </w:lvl>
+    <w:lvl w:ilvl="8" w:tplc="0409001B" w:tentative="1">
+      <w:start w:val="1"/>
+      <w:numFmt w:val="lowerRoman"/>
+      <w:lvlText w:val="%9."/>
+      <w:lvlJc w:val="right"/>
+      <w:pPr>
+        <w:ind w:left="6480" w:hanging="180"/>
+      </w:pPr>
+    </w:lvl>
+  </w:abstractNum>
+  <w:abstractNum w:abstractNumId="13" w15:restartNumberingAfterBreak="0">
+    <w:nsid w:val="1E5C556F"/>
+    <w:multiLevelType w:val="hybridMultilevel"/>
+    <w:tmpl w:val="52A27A32"/>
+    <w:lvl w:ilvl="0" w:tplc="6DBC67F4">
+      <w:start w:val="1"/>
+      <w:numFmt w:val="bullet"/>
+      <w:lvlText w:val="-"/>
+      <w:lvlJc w:val="left"/>
+      <w:pPr>
+        <w:ind w:left="1800" w:hanging="360"/>
+      </w:pPr>
+      <w:rPr>
+        <w:rFonts w:ascii="Arial" w:eastAsia="Calibri" w:hAnsi="Arial" w:cs="Arial" w:hint="default"/>
+      </w:rPr>
+    </w:lvl>
+    <w:lvl w:ilvl="1" w:tplc="04090003" w:tentative="1">
+      <w:start w:val="1"/>
+      <w:numFmt w:val="bullet"/>
+      <w:lvlText w:val="o"/>
+      <w:lvlJc w:val="left"/>
+      <w:pPr>
+        <w:ind w:left="2520" w:hanging="360"/>
+      </w:pPr>
+      <w:rPr>
+        <w:rFonts w:ascii="Courier New" w:hAnsi="Courier New" w:cs="Courier New" w:hint="default"/>
+      </w:rPr>
+    </w:lvl>
+    <w:lvl w:ilvl="2" w:tplc="04090005" w:tentative="1">
+      <w:start w:val="1"/>
+      <w:numFmt w:val="bullet"/>
+      <w:lvlText w:val=""/>
+      <w:lvlJc w:val="left"/>
+      <w:pPr>
+        <w:ind w:left="3240" w:hanging="360"/>
+      </w:pPr>
+      <w:rPr>
+        <w:rFonts w:ascii="Wingdings" w:hAnsi="Wingdings" w:hint="default"/>
+      </w:rPr>
+    </w:lvl>
+    <w:lvl w:ilvl="3" w:tplc="04090001" w:tentative="1">
+      <w:start w:val="1"/>
+      <w:numFmt w:val="bullet"/>
+      <w:lvlText w:val=""/>
+      <w:lvlJc w:val="left"/>
+      <w:pPr>
+        <w:ind w:left="3960" w:hanging="360"/>
+      </w:pPr>
+      <w:rPr>
+        <w:rFonts w:ascii="Symbol" w:hAnsi="Symbol" w:hint="default"/>
+      </w:rPr>
+    </w:lvl>
+    <w:lvl w:ilvl="4" w:tplc="04090003" w:tentative="1">
+      <w:start w:val="1"/>
+      <w:numFmt w:val="bullet"/>
+      <w:lvlText w:val="o"/>
+      <w:lvlJc w:val="left"/>
+      <w:pPr>
+        <w:ind w:left="4680" w:hanging="360"/>
+      </w:pPr>
+      <w:rPr>
+        <w:rFonts w:ascii="Courier New" w:hAnsi="Courier New" w:cs="Courier New" w:hint="default"/>
+      </w:rPr>
+    </w:lvl>
+    <w:lvl w:ilvl="5" w:tplc="04090005" w:tentative="1">
+      <w:start w:val="1"/>
+      <w:numFmt w:val="bullet"/>
+      <w:lvlText w:val=""/>
+      <w:lvlJc w:val="left"/>
+      <w:pPr>
+        <w:ind w:left="5400" w:hanging="360"/>
+      </w:pPr>
+      <w:rPr>
+        <w:rFonts w:ascii="Wingdings" w:hAnsi="Wingdings" w:hint="default"/>
+      </w:rPr>
+    </w:lvl>
+    <w:lvl w:ilvl="6" w:tplc="04090001" w:tentative="1">
+      <w:start w:val="1"/>
+      <w:numFmt w:val="bullet"/>
+      <w:lvlText w:val=""/>
+      <w:lvlJc w:val="left"/>
+      <w:pPr>
+        <w:ind w:left="6120" w:hanging="360"/>
+      </w:pPr>
+      <w:rPr>
+        <w:rFonts w:ascii="Symbol" w:hAnsi="Symbol" w:hint="default"/>
+      </w:rPr>
+    </w:lvl>
+    <w:lvl w:ilvl="7" w:tplc="04090003" w:tentative="1">
+      <w:start w:val="1"/>
+      <w:numFmt w:val="bullet"/>
+      <w:lvlText w:val="o"/>
+      <w:lvlJc w:val="left"/>
+      <w:pPr>
+        <w:ind w:left="6840" w:hanging="360"/>
+      </w:pPr>
+      <w:rPr>
+        <w:rFonts w:ascii="Courier New" w:hAnsi="Courier New" w:cs="Courier New" w:hint="default"/>
+      </w:rPr>
+    </w:lvl>
+    <w:lvl w:ilvl="8" w:tplc="04090005" w:tentative="1">
+      <w:start w:val="1"/>
+      <w:numFmt w:val="bullet"/>
+      <w:lvlText w:val=""/>
+      <w:lvlJc w:val="left"/>
+      <w:pPr>
+        <w:ind w:left="7560" w:hanging="360"/>
+      </w:pPr>
+      <w:rPr>
+        <w:rFonts w:ascii="Wingdings" w:hAnsi="Wingdings" w:hint="default"/>
+      </w:rPr>
+    </w:lvl>
+  </w:abstractNum>
+  <w:abstractNum w:abstractNumId="14" w15:restartNumberingAfterBreak="0">
     <w:nsid w:val="1FB52B5E"/>
     <w:multiLevelType w:val="multilevel"/>
     <w:tmpl w:val="62689B10"/>
@@ -21548,7 +22390,7 @@
       </w:rPr>
     </w:lvl>
   </w:abstractNum>
-  <w:abstractNum w:abstractNumId="13" w15:restartNumberingAfterBreak="0">
+  <w:abstractNum w:abstractNumId="15" w15:restartNumberingAfterBreak="0">
     <w:nsid w:val="20CE428F"/>
     <w:multiLevelType w:val="hybridMultilevel"/>
     <w:tmpl w:val="048001A0"/>
@@ -21638,7 +22480,7 @@
       </w:pPr>
     </w:lvl>
   </w:abstractNum>
-  <w:abstractNum w:abstractNumId="14" w15:restartNumberingAfterBreak="0">
+  <w:abstractNum w:abstractNumId="16" w15:restartNumberingAfterBreak="0">
     <w:nsid w:val="25834A2D"/>
     <w:multiLevelType w:val="multilevel"/>
     <w:tmpl w:val="E91694EC"/>
@@ -21752,7 +22594,7 @@
       </w:rPr>
     </w:lvl>
   </w:abstractNum>
-  <w:abstractNum w:abstractNumId="15" w15:restartNumberingAfterBreak="0">
+  <w:abstractNum w:abstractNumId="17" w15:restartNumberingAfterBreak="0">
     <w:nsid w:val="2C766C9F"/>
     <w:multiLevelType w:val="hybridMultilevel"/>
     <w:tmpl w:val="AA2833FA"/>
@@ -21865,7 +22707,7 @@
       </w:rPr>
     </w:lvl>
   </w:abstractNum>
-  <w:abstractNum w:abstractNumId="16" w15:restartNumberingAfterBreak="0">
+  <w:abstractNum w:abstractNumId="18" w15:restartNumberingAfterBreak="0">
     <w:nsid w:val="323024FC"/>
     <w:multiLevelType w:val="multilevel"/>
     <w:tmpl w:val="0CBAADA6"/>
@@ -21982,7 +22824,7 @@
       </w:rPr>
     </w:lvl>
   </w:abstractNum>
-  <w:abstractNum w:abstractNumId="17" w15:restartNumberingAfterBreak="0">
+  <w:abstractNum w:abstractNumId="19" w15:restartNumberingAfterBreak="0">
     <w:nsid w:val="36FC2B1F"/>
     <w:multiLevelType w:val="hybridMultilevel"/>
     <w:tmpl w:val="C81C525A"/>
@@ -22076,7 +22918,7 @@
       </w:pPr>
     </w:lvl>
   </w:abstractNum>
-  <w:abstractNum w:abstractNumId="18" w15:restartNumberingAfterBreak="0">
+  <w:abstractNum w:abstractNumId="20" w15:restartNumberingAfterBreak="0">
     <w:nsid w:val="39082113"/>
     <w:multiLevelType w:val="multilevel"/>
     <w:tmpl w:val="F85C8D5A"/>
@@ -22193,7 +23035,7 @@
       </w:rPr>
     </w:lvl>
   </w:abstractNum>
-  <w:abstractNum w:abstractNumId="19" w15:restartNumberingAfterBreak="0">
+  <w:abstractNum w:abstractNumId="21" w15:restartNumberingAfterBreak="0">
     <w:nsid w:val="3AD77EDF"/>
     <w:multiLevelType w:val="hybridMultilevel"/>
     <w:tmpl w:val="C81C525A"/>
@@ -22287,7 +23129,93 @@
       </w:pPr>
     </w:lvl>
   </w:abstractNum>
-  <w:abstractNum w:abstractNumId="20" w15:restartNumberingAfterBreak="0">
+  <w:abstractNum w:abstractNumId="22" w15:restartNumberingAfterBreak="0">
+    <w:nsid w:val="3E935308"/>
+    <w:multiLevelType w:val="hybridMultilevel"/>
+    <w:tmpl w:val="45CC2B72"/>
+    <w:lvl w:ilvl="0" w:tplc="0409000F">
+      <w:start w:val="1"/>
+      <w:numFmt w:val="decimal"/>
+      <w:lvlText w:val="%1."/>
+      <w:lvlJc w:val="left"/>
+      <w:pPr>
+        <w:ind w:left="1440" w:hanging="360"/>
+      </w:pPr>
+    </w:lvl>
+    <w:lvl w:ilvl="1" w:tplc="04090019" w:tentative="1">
+      <w:start w:val="1"/>
+      <w:numFmt w:val="lowerLetter"/>
+      <w:lvlText w:val="%2."/>
+      <w:lvlJc w:val="left"/>
+      <w:pPr>
+        <w:ind w:left="2160" w:hanging="360"/>
+      </w:pPr>
+    </w:lvl>
+    <w:lvl w:ilvl="2" w:tplc="0409001B" w:tentative="1">
+      <w:start w:val="1"/>
+      <w:numFmt w:val="lowerRoman"/>
+      <w:lvlText w:val="%3."/>
+      <w:lvlJc w:val="right"/>
+      <w:pPr>
+        <w:ind w:left="2880" w:hanging="180"/>
+      </w:pPr>
+    </w:lvl>
+    <w:lvl w:ilvl="3" w:tplc="0409000F" w:tentative="1">
+      <w:start w:val="1"/>
+      <w:numFmt w:val="decimal"/>
+      <w:lvlText w:val="%4."/>
+      <w:lvlJc w:val="left"/>
+      <w:pPr>
+        <w:ind w:left="3600" w:hanging="360"/>
+      </w:pPr>
+    </w:lvl>
+    <w:lvl w:ilvl="4" w:tplc="04090019" w:tentative="1">
+      <w:start w:val="1"/>
+      <w:numFmt w:val="lowerLetter"/>
+      <w:lvlText w:val="%5."/>
+      <w:lvlJc w:val="left"/>
+      <w:pPr>
+        <w:ind w:left="4320" w:hanging="360"/>
+      </w:pPr>
+    </w:lvl>
+    <w:lvl w:ilvl="5" w:tplc="0409001B" w:tentative="1">
+      <w:start w:val="1"/>
+      <w:numFmt w:val="lowerRoman"/>
+      <w:lvlText w:val="%6."/>
+      <w:lvlJc w:val="right"/>
+      <w:pPr>
+        <w:ind w:left="5040" w:hanging="180"/>
+      </w:pPr>
+    </w:lvl>
+    <w:lvl w:ilvl="6" w:tplc="0409000F" w:tentative="1">
+      <w:start w:val="1"/>
+      <w:numFmt w:val="decimal"/>
+      <w:lvlText w:val="%7."/>
+      <w:lvlJc w:val="left"/>
+      <w:pPr>
+        <w:ind w:left="5760" w:hanging="360"/>
+      </w:pPr>
+    </w:lvl>
+    <w:lvl w:ilvl="7" w:tplc="04090019" w:tentative="1">
+      <w:start w:val="1"/>
+      <w:numFmt w:val="lowerLetter"/>
+      <w:lvlText w:val="%8."/>
+      <w:lvlJc w:val="left"/>
+      <w:pPr>
+        <w:ind w:left="6480" w:hanging="360"/>
+      </w:pPr>
+    </w:lvl>
+    <w:lvl w:ilvl="8" w:tplc="0409001B" w:tentative="1">
+      <w:start w:val="1"/>
+      <w:numFmt w:val="lowerRoman"/>
+      <w:lvlText w:val="%9."/>
+      <w:lvlJc w:val="right"/>
+      <w:pPr>
+        <w:ind w:left="7200" w:hanging="180"/>
+      </w:pPr>
+    </w:lvl>
+  </w:abstractNum>
+  <w:abstractNum w:abstractNumId="23" w15:restartNumberingAfterBreak="0">
     <w:nsid w:val="4016460F"/>
     <w:multiLevelType w:val="hybridMultilevel"/>
     <w:tmpl w:val="F63E6948"/>
@@ -22373,7 +23301,7 @@
       </w:pPr>
     </w:lvl>
   </w:abstractNum>
-  <w:abstractNum w:abstractNumId="21" w15:restartNumberingAfterBreak="0">
+  <w:abstractNum w:abstractNumId="24" w15:restartNumberingAfterBreak="0">
     <w:nsid w:val="42782765"/>
     <w:multiLevelType w:val="hybridMultilevel"/>
     <w:tmpl w:val="90884394"/>
@@ -22490,7 +23418,7 @@
       </w:rPr>
     </w:lvl>
   </w:abstractNum>
-  <w:abstractNum w:abstractNumId="22" w15:restartNumberingAfterBreak="0">
+  <w:abstractNum w:abstractNumId="25" w15:restartNumberingAfterBreak="0">
     <w:nsid w:val="479612BF"/>
     <w:multiLevelType w:val="hybridMultilevel"/>
     <w:tmpl w:val="AE801926"/>
@@ -22576,7 +23504,7 @@
       </w:pPr>
     </w:lvl>
   </w:abstractNum>
-  <w:abstractNum w:abstractNumId="23" w15:restartNumberingAfterBreak="0">
+  <w:abstractNum w:abstractNumId="26" w15:restartNumberingAfterBreak="0">
     <w:nsid w:val="4A5A142A"/>
     <w:multiLevelType w:val="hybridMultilevel"/>
     <w:tmpl w:val="0BDC3AE2"/>
@@ -22665,7 +23593,7 @@
       </w:pPr>
     </w:lvl>
   </w:abstractNum>
-  <w:abstractNum w:abstractNumId="24" w15:restartNumberingAfterBreak="0">
+  <w:abstractNum w:abstractNumId="27" w15:restartNumberingAfterBreak="0">
     <w:nsid w:val="4E5B4457"/>
     <w:multiLevelType w:val="hybridMultilevel"/>
     <w:tmpl w:val="B16E5072"/>
@@ -22778,7 +23706,7 @@
       </w:rPr>
     </w:lvl>
   </w:abstractNum>
-  <w:abstractNum w:abstractNumId="25" w15:restartNumberingAfterBreak="0">
+  <w:abstractNum w:abstractNumId="28" w15:restartNumberingAfterBreak="0">
     <w:nsid w:val="52D877BD"/>
     <w:multiLevelType w:val="hybridMultilevel"/>
     <w:tmpl w:val="091CD6A4"/>
@@ -22868,7 +23796,7 @@
       </w:pPr>
     </w:lvl>
   </w:abstractNum>
-  <w:abstractNum w:abstractNumId="26" w15:restartNumberingAfterBreak="0">
+  <w:abstractNum w:abstractNumId="29" w15:restartNumberingAfterBreak="0">
     <w:nsid w:val="536179CA"/>
     <w:multiLevelType w:val="hybridMultilevel"/>
     <w:tmpl w:val="8ADC7E04"/>
@@ -22958,7 +23886,7 @@
       </w:pPr>
     </w:lvl>
   </w:abstractNum>
-  <w:abstractNum w:abstractNumId="27" w15:restartNumberingAfterBreak="0">
+  <w:abstractNum w:abstractNumId="30" w15:restartNumberingAfterBreak="0">
     <w:nsid w:val="53BE6AB0"/>
     <w:multiLevelType w:val="multilevel"/>
     <w:tmpl w:val="33C444A6"/>
@@ -23075,7 +24003,7 @@
       </w:rPr>
     </w:lvl>
   </w:abstractNum>
-  <w:abstractNum w:abstractNumId="28" w15:restartNumberingAfterBreak="0">
+  <w:abstractNum w:abstractNumId="31" w15:restartNumberingAfterBreak="0">
     <w:nsid w:val="55211650"/>
     <w:multiLevelType w:val="hybridMultilevel"/>
     <w:tmpl w:val="412208AC"/>
@@ -23161,7 +24089,7 @@
       </w:pPr>
     </w:lvl>
   </w:abstractNum>
-  <w:abstractNum w:abstractNumId="29" w15:restartNumberingAfterBreak="0">
+  <w:abstractNum w:abstractNumId="32" w15:restartNumberingAfterBreak="0">
     <w:nsid w:val="5754766F"/>
     <w:multiLevelType w:val="multilevel"/>
     <w:tmpl w:val="72DAA2BE"/>
@@ -23281,7 +24209,7 @@
       </w:rPr>
     </w:lvl>
   </w:abstractNum>
-  <w:abstractNum w:abstractNumId="30" w15:restartNumberingAfterBreak="0">
+  <w:abstractNum w:abstractNumId="33" w15:restartNumberingAfterBreak="0">
     <w:nsid w:val="57854AF4"/>
     <w:multiLevelType w:val="hybridMultilevel"/>
     <w:tmpl w:val="695201B0"/>
@@ -23394,7 +24322,7 @@
       </w:rPr>
     </w:lvl>
   </w:abstractNum>
-  <w:abstractNum w:abstractNumId="31" w15:restartNumberingAfterBreak="0">
+  <w:abstractNum w:abstractNumId="34" w15:restartNumberingAfterBreak="0">
     <w:nsid w:val="593C0AE7"/>
     <w:multiLevelType w:val="multilevel"/>
     <w:tmpl w:val="0DCCB346"/>
@@ -23511,7 +24439,7 @@
       </w:rPr>
     </w:lvl>
   </w:abstractNum>
-  <w:abstractNum w:abstractNumId="32" w15:restartNumberingAfterBreak="0">
+  <w:abstractNum w:abstractNumId="35" w15:restartNumberingAfterBreak="0">
     <w:nsid w:val="593E7447"/>
     <w:multiLevelType w:val="hybridMultilevel"/>
     <w:tmpl w:val="8C4809A0"/>
@@ -23625,7 +24553,7 @@
       </w:rPr>
     </w:lvl>
   </w:abstractNum>
-  <w:abstractNum w:abstractNumId="33" w15:restartNumberingAfterBreak="0">
+  <w:abstractNum w:abstractNumId="36" w15:restartNumberingAfterBreak="0">
     <w:nsid w:val="5B6F6927"/>
     <w:multiLevelType w:val="multilevel"/>
     <w:tmpl w:val="BA2480B2"/>
@@ -23739,7 +24667,7 @@
       </w:rPr>
     </w:lvl>
   </w:abstractNum>
-  <w:abstractNum w:abstractNumId="34" w15:restartNumberingAfterBreak="0">
+  <w:abstractNum w:abstractNumId="37" w15:restartNumberingAfterBreak="0">
     <w:nsid w:val="640F6508"/>
     <w:multiLevelType w:val="multilevel"/>
     <w:tmpl w:val="40848AA0"/>
@@ -23829,7 +24757,7 @@
       </w:pPr>
     </w:lvl>
   </w:abstractNum>
-  <w:abstractNum w:abstractNumId="35" w15:restartNumberingAfterBreak="0">
+  <w:abstractNum w:abstractNumId="38" w15:restartNumberingAfterBreak="0">
     <w:nsid w:val="68165020"/>
     <w:multiLevelType w:val="hybridMultilevel"/>
     <w:tmpl w:val="4762EADC"/>
@@ -23942,7 +24870,7 @@
       </w:rPr>
     </w:lvl>
   </w:abstractNum>
-  <w:abstractNum w:abstractNumId="36" w15:restartNumberingAfterBreak="0">
+  <w:abstractNum w:abstractNumId="39" w15:restartNumberingAfterBreak="0">
     <w:nsid w:val="701D5662"/>
     <w:multiLevelType w:val="hybridMultilevel"/>
     <w:tmpl w:val="8A9ACF1C"/>
@@ -24055,7 +24983,7 @@
       </w:rPr>
     </w:lvl>
   </w:abstractNum>
-  <w:abstractNum w:abstractNumId="37" w15:restartNumberingAfterBreak="0">
+  <w:abstractNum w:abstractNumId="40" w15:restartNumberingAfterBreak="0">
     <w:nsid w:val="750D332F"/>
     <w:multiLevelType w:val="multilevel"/>
     <w:tmpl w:val="0809001D"/>
@@ -24142,7 +25070,7 @@
       </w:pPr>
     </w:lvl>
   </w:abstractNum>
-  <w:abstractNum w:abstractNumId="38" w15:restartNumberingAfterBreak="0">
+  <w:abstractNum w:abstractNumId="41" w15:restartNumberingAfterBreak="0">
     <w:nsid w:val="7538432E"/>
     <w:multiLevelType w:val="hybridMultilevel"/>
     <w:tmpl w:val="11A06852"/>
@@ -24228,7 +25156,7 @@
       </w:pPr>
     </w:lvl>
   </w:abstractNum>
-  <w:abstractNum w:abstractNumId="39" w15:restartNumberingAfterBreak="0">
+  <w:abstractNum w:abstractNumId="42" w15:restartNumberingAfterBreak="0">
     <w:nsid w:val="76EC0333"/>
     <w:multiLevelType w:val="hybridMultilevel"/>
     <w:tmpl w:val="EA8E129C"/>
@@ -24341,7 +25269,7 @@
       </w:rPr>
     </w:lvl>
   </w:abstractNum>
-  <w:abstractNum w:abstractNumId="40" w15:restartNumberingAfterBreak="0">
+  <w:abstractNum w:abstractNumId="43" w15:restartNumberingAfterBreak="0">
     <w:nsid w:val="7C4669C3"/>
     <w:multiLevelType w:val="hybridMultilevel"/>
     <w:tmpl w:val="46C68598"/>
@@ -24454,7 +25382,7 @@
       </w:rPr>
     </w:lvl>
   </w:abstractNum>
-  <w:abstractNum w:abstractNumId="41" w15:restartNumberingAfterBreak="0">
+  <w:abstractNum w:abstractNumId="44" w15:restartNumberingAfterBreak="0">
     <w:nsid w:val="7FC04C26"/>
     <w:multiLevelType w:val="hybridMultilevel"/>
     <w:tmpl w:val="275AF312"/>
@@ -24568,70 +25496,70 @@
     </w:lvl>
   </w:abstractNum>
   <w:num w:numId="1" w16cid:durableId="2082361789">
-    <w:abstractNumId w:val="32"/>
+    <w:abstractNumId w:val="35"/>
   </w:num>
   <w:num w:numId="2" w16cid:durableId="1904024803">
-    <w:abstractNumId w:val="13"/>
+    <w:abstractNumId w:val="15"/>
   </w:num>
   <w:num w:numId="3" w16cid:durableId="1515415608">
     <w:abstractNumId w:val="3"/>
   </w:num>
   <w:num w:numId="4" w16cid:durableId="1104417899">
-    <w:abstractNumId w:val="27"/>
+    <w:abstractNumId w:val="30"/>
   </w:num>
   <w:num w:numId="5" w16cid:durableId="1318874791">
-    <w:abstractNumId w:val="21"/>
+    <w:abstractNumId w:val="24"/>
   </w:num>
   <w:num w:numId="6" w16cid:durableId="570041669">
-    <w:abstractNumId w:val="16"/>
+    <w:abstractNumId w:val="18"/>
   </w:num>
   <w:num w:numId="7" w16cid:durableId="1313679110">
-    <w:abstractNumId w:val="33"/>
+    <w:abstractNumId w:val="36"/>
   </w:num>
   <w:num w:numId="8" w16cid:durableId="161238365">
-    <w:abstractNumId w:val="18"/>
+    <w:abstractNumId w:val="20"/>
   </w:num>
   <w:num w:numId="9" w16cid:durableId="983705837">
-    <w:abstractNumId w:val="26"/>
+    <w:abstractNumId w:val="29"/>
   </w:num>
   <w:num w:numId="10" w16cid:durableId="735589202">
+    <w:abstractNumId w:val="37"/>
+  </w:num>
+  <w:num w:numId="11" w16cid:durableId="2138405484">
+    <w:abstractNumId w:val="14"/>
+  </w:num>
+  <w:num w:numId="12" w16cid:durableId="1912542048">
     <w:abstractNumId w:val="34"/>
   </w:num>
-  <w:num w:numId="11" w16cid:durableId="2138405484">
-    <w:abstractNumId w:val="12"/>
-  </w:num>
-  <w:num w:numId="12" w16cid:durableId="1912542048">
-    <w:abstractNumId w:val="31"/>
-  </w:num>
   <w:num w:numId="13" w16cid:durableId="2010324936">
-    <w:abstractNumId w:val="14"/>
+    <w:abstractNumId w:val="16"/>
   </w:num>
   <w:num w:numId="14" w16cid:durableId="1875463834">
     <w:abstractNumId w:val="4"/>
   </w:num>
   <w:num w:numId="15" w16cid:durableId="582298619">
-    <w:abstractNumId w:val="29"/>
+    <w:abstractNumId w:val="32"/>
   </w:num>
   <w:num w:numId="16" w16cid:durableId="55977353">
     <w:abstractNumId w:val="11"/>
   </w:num>
   <w:num w:numId="17" w16cid:durableId="1116145369">
-    <w:abstractNumId w:val="37"/>
+    <w:abstractNumId w:val="40"/>
   </w:num>
   <w:num w:numId="18" w16cid:durableId="2035378518">
-    <w:abstractNumId w:val="24"/>
+    <w:abstractNumId w:val="27"/>
   </w:num>
   <w:num w:numId="19" w16cid:durableId="1731034436">
-    <w:abstractNumId w:val="39"/>
+    <w:abstractNumId w:val="42"/>
   </w:num>
   <w:num w:numId="20" w16cid:durableId="153762890">
-    <w:abstractNumId w:val="40"/>
+    <w:abstractNumId w:val="43"/>
   </w:num>
   <w:num w:numId="21" w16cid:durableId="190848938">
     <w:abstractNumId w:val="1"/>
   </w:num>
   <w:num w:numId="22" w16cid:durableId="2029982242">
-    <w:abstractNumId w:val="35"/>
+    <w:abstractNumId w:val="38"/>
   </w:num>
   <w:num w:numId="23" w16cid:durableId="1554268784">
     <w:abstractNumId w:val="9"/>
@@ -24640,19 +25568,19 @@
     <w:abstractNumId w:val="2"/>
   </w:num>
   <w:num w:numId="25" w16cid:durableId="1183978982">
-    <w:abstractNumId w:val="28"/>
+    <w:abstractNumId w:val="31"/>
   </w:num>
   <w:num w:numId="26" w16cid:durableId="1699043613">
-    <w:abstractNumId w:val="38"/>
+    <w:abstractNumId w:val="41"/>
   </w:num>
   <w:num w:numId="27" w16cid:durableId="476722731">
-    <w:abstractNumId w:val="20"/>
+    <w:abstractNumId w:val="23"/>
   </w:num>
   <w:num w:numId="28" w16cid:durableId="1871062609">
-    <w:abstractNumId w:val="15"/>
+    <w:abstractNumId w:val="17"/>
   </w:num>
   <w:num w:numId="29" w16cid:durableId="1188641840">
-    <w:abstractNumId w:val="23"/>
+    <w:abstractNumId w:val="26"/>
   </w:num>
   <w:num w:numId="30" w16cid:durableId="701325335">
     <w:abstractNumId w:val="10"/>
@@ -24661,13 +25589,13 @@
     <w:abstractNumId w:val="6"/>
   </w:num>
   <w:num w:numId="32" w16cid:durableId="275991361">
-    <w:abstractNumId w:val="22"/>
+    <w:abstractNumId w:val="25"/>
   </w:num>
   <w:num w:numId="33" w16cid:durableId="859661526">
-    <w:abstractNumId w:val="41"/>
+    <w:abstractNumId w:val="44"/>
   </w:num>
   <w:num w:numId="34" w16cid:durableId="964891600">
-    <w:abstractNumId w:val="30"/>
+    <w:abstractNumId w:val="33"/>
   </w:num>
   <w:num w:numId="35" w16cid:durableId="905147808">
     <w:abstractNumId w:val="8"/>
@@ -24676,22 +25604,22 @@
     <w:abstractNumId w:val="7"/>
   </w:num>
   <w:num w:numId="37" w16cid:durableId="1996713782">
-    <w:abstractNumId w:val="19"/>
+    <w:abstractNumId w:val="21"/>
   </w:num>
   <w:num w:numId="38" w16cid:durableId="818424961">
     <w:abstractNumId w:val="0"/>
   </w:num>
   <w:num w:numId="39" w16cid:durableId="1917133308">
-    <w:abstractNumId w:val="36"/>
+    <w:abstractNumId w:val="39"/>
   </w:num>
   <w:num w:numId="40" w16cid:durableId="2079748199">
     <w:abstractNumId w:val="5"/>
   </w:num>
   <w:num w:numId="41" w16cid:durableId="2022776211">
-    <w:abstractNumId w:val="17"/>
+    <w:abstractNumId w:val="19"/>
   </w:num>
   <w:num w:numId="42" w16cid:durableId="1479686497">
-    <w:abstractNumId w:val="25"/>
+    <w:abstractNumId w:val="28"/>
     <w:lvlOverride w:ilvl="0">
       <w:startOverride w:val="1"/>
     </w:lvlOverride>
@@ -24719,6 +25647,15 @@
     <w:lvlOverride w:ilvl="8">
       <w:startOverride w:val="1"/>
     </w:lvlOverride>
+  </w:num>
+  <w:num w:numId="43" w16cid:durableId="2100371661">
+    <w:abstractNumId w:val="12"/>
+  </w:num>
+  <w:num w:numId="44" w16cid:durableId="740755924">
+    <w:abstractNumId w:val="22"/>
+  </w:num>
+  <w:num w:numId="45" w16cid:durableId="1034035212">
+    <w:abstractNumId w:val="13"/>
   </w:num>
   <w:numIdMacAtCleanup w:val="37"/>
 </w:numbering>
@@ -25247,7 +26184,6 @@
   <w:style w:type="character" w:default="1" w:styleId="DefaultParagraphFont">
     <w:name w:val="Default Paragraph Font"/>
     <w:uiPriority w:val="1"/>
-    <w:semiHidden/>
     <w:unhideWhenUsed/>
   </w:style>
   <w:style w:type="table" w:default="1" w:styleId="TableNormal">
@@ -26937,64 +27873,6 @@
   <w:docParts>
     <w:docPart>
       <w:docPartPr>
-        <w:name w:val="1AED4CE419634409A4DE22308F25DFFF"/>
-        <w:category>
-          <w:name w:val="General"/>
-          <w:gallery w:val="placeholder"/>
-        </w:category>
-        <w:types>
-          <w:type w:val="bbPlcHdr"/>
-        </w:types>
-        <w:behaviors>
-          <w:behavior w:val="content"/>
-        </w:behaviors>
-        <w:guid w:val="{FC9C570A-D4A5-4F9A-B515-B331B1BD5AD4}"/>
-      </w:docPartPr>
-      <w:docPartBody>
-        <w:p>
-          <w:pPr>
-            <w:pStyle w:val="1AED4CE419634409A4DE22308F25DFFF"/>
-          </w:pPr>
-          <w:r>
-            <w:rPr>
-              <w:shd w:val="clear" w:color="auto" w:fill="FFFFCC"/>
-            </w:rPr>
-            <w:t>Insert name</w:t>
-          </w:r>
-        </w:p>
-      </w:docPartBody>
-    </w:docPart>
-    <w:docPart>
-      <w:docPartPr>
-        <w:name w:val="B74775F5CEEB4AA8AA997E9C4E225814"/>
-        <w:category>
-          <w:name w:val="General"/>
-          <w:gallery w:val="placeholder"/>
-        </w:category>
-        <w:types>
-          <w:type w:val="bbPlcHdr"/>
-        </w:types>
-        <w:behaviors>
-          <w:behavior w:val="content"/>
-        </w:behaviors>
-        <w:guid w:val="{5BEA7E0E-045C-4CCB-9406-DD7E8745096D}"/>
-      </w:docPartPr>
-      <w:docPartBody>
-        <w:p>
-          <w:pPr>
-            <w:pStyle w:val="B74775F5CEEB4AA8AA997E9C4E225814"/>
-          </w:pPr>
-          <w:r>
-            <w:rPr>
-              <w:shd w:val="clear" w:color="auto" w:fill="FFFFCC"/>
-            </w:rPr>
-            <w:t>Insert ID</w:t>
-          </w:r>
-        </w:p>
-      </w:docPartBody>
-    </w:docPart>
-    <w:docPart>
-      <w:docPartPr>
         <w:name w:val="9FCAF8BA89D64C7B97AB3C571758D813"/>
         <w:category>
           <w:name w:val="General"/>
@@ -27248,7 +28126,7 @@
     <w:charset w:val="00"/>
     <w:family w:val="swiss"/>
     <w:pitch w:val="variable"/>
-    <w:sig w:usb0="E4002EFF" w:usb1="C000247B" w:usb2="00000009" w:usb3="00000000" w:csb0="000001FF" w:csb1="00000000"/>
+    <w:sig w:usb0="E4002EFF" w:usb1="C200247B" w:usb2="00000009" w:usb3="00000000" w:csb0="000001FF" w:csb1="00000000"/>
   </w:font>
   <w:font w:name="VIC">
     <w:altName w:val="Calibri"/>
@@ -27268,7 +28146,7 @@
   </w:font>
   <w:font w:name="PMingLiU">
     <w:altName w:val="新細明體"/>
-    <w:panose1 w:val="02020500000000000000"/>
+    <w:panose1 w:val="02010601000101010101"/>
     <w:charset w:val="88"/>
     <w:family w:val="roman"/>
     <w:pitch w:val="variable"/>
@@ -27316,12 +28194,17 @@
     <w:pitch w:val="variable"/>
     <w:sig w:usb0="800001E3" w:usb1="1200FFEF" w:usb2="00040000" w:usb3="00000000" w:csb0="00000001" w:csb1="00000000"/>
   </w:font>
-  <w:font w:name="Calibri Light">
-    <w:panose1 w:val="020F0302020204030204"/>
+  <w:font w:name="Aptos">
     <w:charset w:val="00"/>
     <w:family w:val="swiss"/>
     <w:pitch w:val="variable"/>
-    <w:sig w:usb0="E4002EFF" w:usb1="C000247B" w:usb2="00000009" w:usb3="00000000" w:csb0="000001FF" w:csb1="00000000"/>
+    <w:sig w:usb0="20000287" w:usb1="00000003" w:usb2="00000000" w:usb3="00000000" w:csb0="0000019F" w:csb1="00000000"/>
+  </w:font>
+  <w:font w:name="Aptos Display">
+    <w:charset w:val="00"/>
+    <w:family w:val="swiss"/>
+    <w:pitch w:val="variable"/>
+    <w:sig w:usb0="20000287" w:usb1="00000003" w:usb2="00000000" w:usb3="00000000" w:csb0="0000019F" w:csb1="00000000"/>
   </w:font>
 </w:fonts>
 </file>
@@ -27353,6 +28236,7 @@
     <w:rsid w:val="001854B8"/>
     <w:rsid w:val="00260D0B"/>
     <w:rsid w:val="002670B5"/>
+    <w:rsid w:val="00290609"/>
     <w:rsid w:val="002C17CD"/>
     <w:rsid w:val="003F4644"/>
     <w:rsid w:val="003F53EF"/>
@@ -27362,8 +28246,10 @@
     <w:rsid w:val="0079385F"/>
     <w:rsid w:val="007D771B"/>
     <w:rsid w:val="00912EE7"/>
+    <w:rsid w:val="00936BFD"/>
     <w:rsid w:val="00A8404B"/>
     <w:rsid w:val="00A84CD7"/>
+    <w:rsid w:val="00AC322F"/>
     <w:rsid w:val="00B63A71"/>
     <w:rsid w:val="00BA61B4"/>
     <w:rsid w:val="00BB4062"/>
@@ -27831,27 +28717,6 @@
   <w:style w:type="paragraph" w:customStyle="1" w:styleId="9FCAF8BA89D64C7B97AB3C571758D813">
     <w:name w:val="9FCAF8BA89D64C7B97AB3C571758D813"/>
   </w:style>
-  <w:style w:type="paragraph" w:customStyle="1" w:styleId="C3F9223DA456430A8AF7C38CE474A2BA">
-    <w:name w:val="C3F9223DA456430A8AF7C38CE474A2BA"/>
-  </w:style>
-  <w:style w:type="paragraph" w:customStyle="1" w:styleId="1B673336D57545ADAC05FC101C1570B4">
-    <w:name w:val="1B673336D57545ADAC05FC101C1570B4"/>
-  </w:style>
-  <w:style w:type="paragraph" w:customStyle="1" w:styleId="24A5DD797AA0401880C94A8720123519">
-    <w:name w:val="24A5DD797AA0401880C94A8720123519"/>
-  </w:style>
-  <w:style w:type="paragraph" w:customStyle="1" w:styleId="D1E6007C3BF944C9B8130F76C4D01C2C">
-    <w:name w:val="D1E6007C3BF944C9B8130F76C4D01C2C"/>
-  </w:style>
-  <w:style w:type="paragraph" w:customStyle="1" w:styleId="2FFACB32BB844264AB7062FCA2E0DC8B">
-    <w:name w:val="2FFACB32BB844264AB7062FCA2E0DC8B"/>
-  </w:style>
-  <w:style w:type="paragraph" w:customStyle="1" w:styleId="03DCC86ED4874369AFDA6478849E1BD9">
-    <w:name w:val="03DCC86ED4874369AFDA6478849E1BD9"/>
-  </w:style>
-  <w:style w:type="paragraph" w:customStyle="1" w:styleId="2B172D0B17DC4481BDD0F787FA264B0E">
-    <w:name w:val="2B172D0B17DC4481BDD0F787FA264B0E"/>
-  </w:style>
   <w:style w:type="paragraph" w:customStyle="1" w:styleId="2A46E76980404F4DBB9073FB281E1605">
     <w:name w:val="2A46E76980404F4DBB9073FB281E1605"/>
     <w:rsid w:val="00A8404B"/>
@@ -28190,6 +29055,27 @@
 </file>
 
 <file path=customXml/item1.xml><?xml version="1.0" encoding="utf-8"?>
+<?mso-contentType ?>
+<FormTemplates xmlns="http://schemas.microsoft.com/sharepoint/v3/contenttype/forms">
+  <Display>DocumentLibraryForm</Display>
+  <Edit>DocumentLibraryForm</Edit>
+  <New>DocumentLibraryForm</New>
+</FormTemplates>
+</file>
+
+<file path=customXml/item2.xml><?xml version="1.0" encoding="utf-8"?>
+<b:Sources xmlns:b="http://schemas.openxmlformats.org/officeDocument/2006/bibliography" xmlns="http://schemas.openxmlformats.org/officeDocument/2006/bibliography" SelectedStyle="\APASixthEditionOfficeOnline.xsl" StyleName="APA" Version="6"/>
+</file>
+
+<file path=customXml/item3.xml><?xml version="1.0" encoding="utf-8"?>
+<p:properties xmlns:p="http://schemas.microsoft.com/office/2006/metadata/properties" xmlns:xsi="http://www.w3.org/2001/XMLSchema-instance" xmlns:pc="http://schemas.microsoft.com/office/infopath/2007/PartnerControls">
+  <documentManagement>
+    <_activity xmlns="fc400f29-8ae2-4f02-aa36-8354319d8dd0" xsi:nil="true"/>
+  </documentManagement>
+</p:properties>
+</file>
+
+<file path=customXml/item4.xml><?xml version="1.0" encoding="utf-8"?>
 <ct:contentTypeSchema xmlns:ct="http://schemas.microsoft.com/office/2006/metadata/contentType" xmlns:ma="http://schemas.microsoft.com/office/2006/metadata/properties/metaAttributes" ct:_="" ma:_="" ma:contentTypeName="Document" ma:contentTypeID="0x0101002FED5117B94A0C43BE657CFE95077C6E" ma:contentTypeVersion="17" ma:contentTypeDescription="Create a new document." ma:contentTypeScope="" ma:versionID="1b61ef74c0cf3f1787575cceeb5049c4">
   <xsd:schema xmlns:xsd="http://www.w3.org/2001/XMLSchema" xmlns:xs="http://www.w3.org/2001/XMLSchema" xmlns:p="http://schemas.microsoft.com/office/2006/metadata/properties" xmlns:ns3="fc400f29-8ae2-4f02-aa36-8354319d8dd0" xmlns:ns4="a53e46f7-009c-4700-bfb1-03be8983c549" targetNamespace="http://schemas.microsoft.com/office/2006/metadata/properties" ma:root="true" ma:fieldsID="a097de4b958cf184ce63d565c2177212" ns3:_="" ns4:_="">
     <xsd:import namespace="fc400f29-8ae2-4f02-aa36-8354319d8dd0"/>
@@ -28436,28 +29322,33 @@
 </ct:contentTypeSchema>
 </file>
 
-<file path=customXml/item2.xml><?xml version="1.0" encoding="utf-8"?>
-<p:properties xmlns:p="http://schemas.microsoft.com/office/2006/metadata/properties" xmlns:xsi="http://www.w3.org/2001/XMLSchema-instance" xmlns:pc="http://schemas.microsoft.com/office/infopath/2007/PartnerControls">
-  <documentManagement>
-    <_activity xmlns="fc400f29-8ae2-4f02-aa36-8354319d8dd0" xsi:nil="true"/>
-  </documentManagement>
-</p:properties>
+<file path=customXml/itemProps1.xml><?xml version="1.0" encoding="utf-8"?>
+<ds:datastoreItem xmlns:ds="http://schemas.openxmlformats.org/officeDocument/2006/customXml" ds:itemID="{E3499DD3-E433-4477-A8FE-2A9B10275570}">
+  <ds:schemaRefs>
+    <ds:schemaRef ds:uri="http://schemas.microsoft.com/sharepoint/v3/contenttype/forms"/>
+  </ds:schemaRefs>
+</ds:datastoreItem>
 </file>
 
-<file path=customXml/item3.xml><?xml version="1.0" encoding="utf-8"?>
-<b:Sources xmlns:b="http://schemas.openxmlformats.org/officeDocument/2006/bibliography" xmlns="http://schemas.openxmlformats.org/officeDocument/2006/bibliography" SelectedStyle="\APASixthEditionOfficeOnline.xsl" StyleName="APA" Version="6"/>
+<file path=customXml/itemProps2.xml><?xml version="1.0" encoding="utf-8"?>
+<ds:datastoreItem xmlns:ds="http://schemas.openxmlformats.org/officeDocument/2006/customXml" ds:itemID="{138E37DC-799B-405C-A13E-5691141C154C}">
+  <ds:schemaRefs>
+    <ds:schemaRef ds:uri="http://schemas.openxmlformats.org/officeDocument/2006/bibliography"/>
+  </ds:schemaRefs>
+</ds:datastoreItem>
 </file>
 
-<file path=customXml/item4.xml><?xml version="1.0" encoding="utf-8"?>
-<?mso-contentType ?>
-<FormTemplates xmlns="http://schemas.microsoft.com/sharepoint/v3/contenttype/forms">
-  <Display>DocumentLibraryForm</Display>
-  <Edit>DocumentLibraryForm</Edit>
-  <New>DocumentLibraryForm</New>
-</FormTemplates>
+<file path=customXml/itemProps3.xml><?xml version="1.0" encoding="utf-8"?>
+<ds:datastoreItem xmlns:ds="http://schemas.openxmlformats.org/officeDocument/2006/customXml" ds:itemID="{3A0AC818-964C-4D39-B25F-D98F3F83829C}">
+  <ds:schemaRefs>
+    <ds:schemaRef ds:uri="http://schemas.microsoft.com/office/2006/metadata/properties"/>
+    <ds:schemaRef ds:uri="http://schemas.microsoft.com/office/infopath/2007/PartnerControls"/>
+    <ds:schemaRef ds:uri="fc400f29-8ae2-4f02-aa36-8354319d8dd0"/>
+  </ds:schemaRefs>
+</ds:datastoreItem>
 </file>
 
-<file path=customXml/itemProps1.xml><?xml version="1.0" encoding="utf-8"?>
+<file path=customXml/itemProps4.xml><?xml version="1.0" encoding="utf-8"?>
 <ds:datastoreItem xmlns:ds="http://schemas.openxmlformats.org/officeDocument/2006/customXml" ds:itemID="{B6942B79-D663-4AEC-A309-D8E420D7B2CD}">
   <ds:schemaRefs>
     <ds:schemaRef ds:uri="http://schemas.microsoft.com/office/2006/metadata/contentType"/>
@@ -28474,30 +29365,4 @@
     <ds:schemaRef ds:uri="http://schemas.microsoft.com/internal/obd"/>
   </ds:schemaRefs>
 </ds:datastoreItem>
-</file>
-
-<file path=customXml/itemProps2.xml><?xml version="1.0" encoding="utf-8"?>
-<ds:datastoreItem xmlns:ds="http://schemas.openxmlformats.org/officeDocument/2006/customXml" ds:itemID="{3A0AC818-964C-4D39-B25F-D98F3F83829C}">
-  <ds:schemaRefs>
-    <ds:schemaRef ds:uri="http://schemas.microsoft.com/office/2006/metadata/properties"/>
-    <ds:schemaRef ds:uri="http://schemas.microsoft.com/office/infopath/2007/PartnerControls"/>
-    <ds:schemaRef ds:uri="fc400f29-8ae2-4f02-aa36-8354319d8dd0"/>
-  </ds:schemaRefs>
-</ds:datastoreItem>
-</file>
-
-<file path=customXml/itemProps3.xml><?xml version="1.0" encoding="utf-8"?>
-<ds:datastoreItem xmlns:ds="http://schemas.openxmlformats.org/officeDocument/2006/customXml" ds:itemID="{138E37DC-799B-405C-A13E-5691141C154C}">
-  <ds:schemaRefs>
-    <ds:schemaRef ds:uri="http://schemas.openxmlformats.org/officeDocument/2006/bibliography"/>
-  </ds:schemaRefs>
-</ds:datastoreItem>
-</file>
-
-<file path=customXml/itemProps4.xml><?xml version="1.0" encoding="utf-8"?>
-<ds:datastoreItem xmlns:ds="http://schemas.openxmlformats.org/officeDocument/2006/customXml" ds:itemID="{E3499DD3-E433-4477-A8FE-2A9B10275570}">
-  <ds:schemaRefs>
-    <ds:schemaRef ds:uri="http://schemas.microsoft.com/sharepoint/v3/contenttype/forms"/>
-  </ds:schemaRefs>
-</ds:datastoreItem>
 </file>
</xml_diff>